<commit_message>
Repaired git and removed example data from commit. Future download link available. Small edit to guide.
</commit_message>
<xml_diff>
--- a/Documents/MeMRI_Toolbox_Quick_Start_Guide.docx
+++ b/Documents/MeMRI_Toolbox_Quick_Start_Guide.docx
@@ -72,8 +72,16 @@
         <w:rPr>
           <w:lang w:val="en-US"/>
         </w:rPr>
-        <w:t xml:space="preserve"> (MeMRI</w:t>
-      </w:r>
+        <w:t xml:space="preserve"> (</w:t>
+      </w:r>
+      <w:proofErr w:type="spellStart"/>
+      <w:r>
+        <w:rPr>
+          <w:lang w:val="en-US"/>
+        </w:rPr>
+        <w:t>MeMRI</w:t>
+      </w:r>
+      <w:proofErr w:type="spellEnd"/>
       <w:r>
         <w:rPr>
           <w:lang w:val="en-US"/>
@@ -1394,11 +1402,19 @@
           <w:lang w:val="en-US"/>
         </w:rPr>
       </w:pPr>
-      <w:r>
-        <w:rPr>
-          <w:lang w:val="en-US"/>
-        </w:rPr>
-        <w:t xml:space="preserve">MeMRI PTB can be </w:t>
+      <w:proofErr w:type="spellStart"/>
+      <w:r>
+        <w:rPr>
+          <w:lang w:val="en-US"/>
+        </w:rPr>
+        <w:t>MeMRI</w:t>
+      </w:r>
+      <w:proofErr w:type="spellEnd"/>
+      <w:r>
+        <w:rPr>
+          <w:lang w:val="en-US"/>
+        </w:rPr>
+        <w:t xml:space="preserve"> PTB can be </w:t>
       </w:r>
       <w:r>
         <w:rPr>
@@ -1521,14 +1537,7 @@
             <w:rStyle w:val="Hyperlink"/>
             <w:lang w:val="en-US"/>
           </w:rPr>
-          <w:t>https://github.com/Illuminate-MeMRI/</w:t>
-        </w:r>
-        <w:r>
-          <w:rPr>
-            <w:rStyle w:val="Hyperlink"/>
-            <w:lang w:val="en-US"/>
-          </w:rPr>
-          <w:t>Metabolic-MRI-Processing-Toolbox</w:t>
+          <w:t>https://github.com/Illuminate-MeMRI/Metabolic-MRI-Processing-Toolbox</w:t>
         </w:r>
       </w:hyperlink>
     </w:p>
@@ -1536,60 +1545,60 @@
       <w:pPr>
         <w:pStyle w:val="Heading2"/>
         <w:rPr>
+          <w:lang w:val="en-US"/>
+        </w:rPr>
+      </w:pPr>
+      <w:bookmarkStart w:id="2" w:name="_Github_in_MATLAB"/>
+      <w:bookmarkStart w:id="3" w:name="_Toc231916330"/>
+      <w:bookmarkEnd w:id="2"/>
+      <w:r>
+        <w:rPr>
+          <w:lang w:val="en-US"/>
+        </w:rPr>
+        <w:t>Github</w:t>
+      </w:r>
+      <w:r>
+        <w:rPr>
+          <w:lang w:val="en-US"/>
+        </w:rPr>
+        <w:t xml:space="preserve"> in MATLAB</w:t>
+      </w:r>
+      <w:bookmarkEnd w:id="3"/>
+    </w:p>
+    <w:p>
+      <w:pPr>
+        <w:jc w:val="both"/>
+        <w:rPr>
           <w:lang w:val="it-IT"/>
         </w:rPr>
       </w:pPr>
-      <w:bookmarkStart w:id="2" w:name="_Toc231916330"/>
-      <w:bookmarkStart w:id="3" w:name="_Github_in_MATLAB"/>
-      <w:bookmarkEnd w:id="3"/>
-      <w:r>
-        <w:rPr>
-          <w:lang w:val="it-IT"/>
-        </w:rPr>
-        <w:t>Github</w:t>
-      </w:r>
-      <w:r>
-        <w:rPr>
-          <w:lang w:val="it-IT"/>
-        </w:rPr>
-        <w:t xml:space="preserve"> in MATLAB</w:t>
-      </w:r>
-      <w:bookmarkEnd w:id="2"/>
-    </w:p>
-    <w:p>
-      <w:pPr>
-        <w:jc w:val="both"/>
-        <w:rPr>
-          <w:lang w:val="it-IT"/>
-        </w:rPr>
-      </w:pPr>
-      <w:r>
-        <w:rPr>
-          <w:lang w:val="it-IT"/>
+      <w:r>
+        <w:rPr>
+          <w:lang w:val="en-US"/>
         </w:rPr>
         <w:t>Create an empty folder</w:t>
       </w:r>
       <w:r>
         <w:rPr>
-          <w:lang w:val="it-IT"/>
+          <w:lang w:val="en-US"/>
         </w:rPr>
         <w:t xml:space="preserve"> for MeMRI</w:t>
       </w:r>
       <w:r>
         <w:rPr>
-          <w:lang w:val="it-IT"/>
+          <w:lang w:val="en-US"/>
         </w:rPr>
         <w:t>-</w:t>
       </w:r>
       <w:r>
         <w:rPr>
-          <w:lang w:val="it-IT"/>
+          <w:lang w:val="en-US"/>
         </w:rPr>
         <w:t xml:space="preserve">PTB </w:t>
       </w:r>
       <w:r>
         <w:rPr>
-          <w:lang w:val="it-IT"/>
+          <w:lang w:val="en-US"/>
         </w:rPr>
         <w:t xml:space="preserve">named </w:t>
       </w:r>
@@ -1597,245 +1606,267 @@
         <w:rPr>
           <w:i/>
           <w:iCs/>
-          <w:lang w:val="it-IT"/>
-        </w:rPr>
-        <w:t>Metabolic-MRI-Processing-Too</w:t>
+          <w:lang w:val="en-US"/>
+        </w:rPr>
+        <w:t>Metabolic-MRI-Processing-Toolbox</w:t>
+      </w:r>
+      <w:r>
+        <w:rPr>
+          <w:lang w:val="en-US"/>
+        </w:rPr>
+        <w:t xml:space="preserve"> </w:t>
+      </w:r>
+      <w:r>
+        <w:rPr>
+          <w:lang w:val="en-US"/>
+        </w:rPr>
+        <w:t xml:space="preserve">in MATLAB </w:t>
+      </w:r>
+      <w:r>
+        <w:rPr>
+          <w:lang w:val="en-US"/>
+        </w:rPr>
+        <w:t>using the</w:t>
+      </w:r>
+      <w:r>
+        <w:rPr>
+          <w:lang w:val="en-US"/>
+        </w:rPr>
+        <w:t xml:space="preserve"> </w:t>
+      </w:r>
+      <w:r>
+        <w:rPr>
+          <w:lang w:val="en-US"/>
+        </w:rPr>
+        <w:t>“</w:t>
+      </w:r>
+      <w:r>
+        <w:rPr>
+          <w:lang w:val="en-US"/>
+        </w:rPr>
+        <w:t>Current Folder</w:t>
+      </w:r>
+      <w:r>
+        <w:rPr>
+          <w:lang w:val="en-US"/>
+        </w:rPr>
+        <w:t>”</w:t>
+      </w:r>
+      <w:r>
+        <w:rPr>
+          <w:lang w:val="en-US"/>
+        </w:rPr>
+        <w:t xml:space="preserve"> pane</w:t>
+      </w:r>
+      <w:r>
+        <w:rPr>
+          <w:lang w:val="en-US"/>
+        </w:rPr>
+        <w:t xml:space="preserve"> via right-click &gt; New &gt; Folder</w:t>
+      </w:r>
+      <w:r>
+        <w:rPr>
+          <w:lang w:val="en-US"/>
+        </w:rPr>
+        <w:t xml:space="preserve">. </w:t>
+      </w:r>
+      <w:r>
+        <w:rPr>
+          <w:lang w:val="en-US"/>
+        </w:rPr>
+        <w:t>Open the directory</w:t>
+      </w:r>
+      <w:r>
+        <w:rPr>
+          <w:lang w:val="en-US"/>
+        </w:rPr>
+        <w:t xml:space="preserve"> </w:t>
       </w:r>
       <w:r>
         <w:rPr>
           <w:i/>
           <w:iCs/>
-          <w:lang w:val="it-IT"/>
-        </w:rPr>
-        <w:t>lbox</w:t>
-      </w:r>
-      <w:r>
-        <w:rPr>
-          <w:lang w:val="it-IT"/>
-        </w:rPr>
-        <w:t xml:space="preserve"> </w:t>
-      </w:r>
-      <w:r>
-        <w:rPr>
-          <w:lang w:val="it-IT"/>
-        </w:rPr>
-        <w:t xml:space="preserve">in MATLAB </w:t>
-      </w:r>
-      <w:r>
-        <w:rPr>
-          <w:lang w:val="it-IT"/>
-        </w:rPr>
-        <w:t>using the</w:t>
-      </w:r>
-      <w:r>
-        <w:rPr>
-          <w:lang w:val="it-IT"/>
-        </w:rPr>
-        <w:t xml:space="preserve"> </w:t>
-      </w:r>
-      <w:r>
-        <w:rPr>
-          <w:lang w:val="it-IT"/>
-        </w:rPr>
-        <w:t>“</w:t>
-      </w:r>
-      <w:r>
-        <w:rPr>
-          <w:lang w:val="it-IT"/>
-        </w:rPr>
-        <w:t>Current Folder</w:t>
-      </w:r>
-      <w:r>
-        <w:rPr>
-          <w:lang w:val="it-IT"/>
-        </w:rPr>
-        <w:t>”</w:t>
-      </w:r>
-      <w:r>
-        <w:rPr>
-          <w:lang w:val="it-IT"/>
-        </w:rPr>
-        <w:t xml:space="preserve"> pane</w:t>
-      </w:r>
-      <w:r>
-        <w:rPr>
-          <w:lang w:val="it-IT"/>
-        </w:rPr>
-        <w:t xml:space="preserve"> via right-click &gt; New &gt; Folder</w:t>
-      </w:r>
-      <w:r>
-        <w:rPr>
-          <w:lang w:val="it-IT"/>
-        </w:rPr>
-        <w:t xml:space="preserve">. </w:t>
-      </w:r>
-      <w:r>
-        <w:rPr>
-          <w:lang w:val="it-IT"/>
-        </w:rPr>
-        <w:t>Open the directory</w:t>
-      </w:r>
-      <w:r>
-        <w:rPr>
-          <w:lang w:val="it-IT"/>
-        </w:rPr>
-        <w:t xml:space="preserve"> </w:t>
+          <w:lang w:val="en-US"/>
+        </w:rPr>
+        <w:t>Metabolic-MRI-</w:t>
       </w:r>
       <w:r>
         <w:rPr>
           <w:i/>
           <w:iCs/>
-          <w:lang w:val="it-IT"/>
-        </w:rPr>
-        <w:t>Metabolic-MRI-</w:t>
+          <w:lang w:val="en-US"/>
+        </w:rPr>
+        <w:t>Processing-</w:t>
       </w:r>
       <w:r>
         <w:rPr>
           <w:i/>
           <w:iCs/>
-          <w:lang w:val="it-IT"/>
-        </w:rPr>
-        <w:t>Processing-</w:t>
+          <w:lang w:val="en-US"/>
+        </w:rPr>
+        <w:t>Toolbox</w:t>
+      </w:r>
+      <w:r>
+        <w:rPr>
+          <w:lang w:val="en-US"/>
+        </w:rPr>
+        <w:t xml:space="preserve"> and</w:t>
+      </w:r>
+      <w:r>
+        <w:rPr>
+          <w:lang w:val="en-US"/>
+        </w:rPr>
+        <w:t xml:space="preserve"> right-click in</w:t>
+      </w:r>
+      <w:r>
+        <w:rPr>
+          <w:lang w:val="en-US"/>
+        </w:rPr>
+        <w:t>side</w:t>
+      </w:r>
+      <w:r>
+        <w:rPr>
+          <w:lang w:val="en-US"/>
+        </w:rPr>
+        <w:t xml:space="preserve"> the white space</w:t>
+      </w:r>
+      <w:r>
+        <w:rPr>
+          <w:lang w:val="en-US"/>
+        </w:rPr>
+        <w:t xml:space="preserve"> of the </w:t>
+      </w:r>
+      <w:r>
+        <w:rPr>
+          <w:lang w:val="en-US"/>
+        </w:rPr>
+        <w:t>“</w:t>
       </w:r>
       <w:r>
         <w:rPr>
           <w:i/>
           <w:iCs/>
-          <w:lang w:val="it-IT"/>
-        </w:rPr>
-        <w:t>Toolbox</w:t>
-      </w:r>
-      <w:r>
-        <w:rPr>
-          <w:lang w:val="it-IT"/>
-        </w:rPr>
-        <w:t xml:space="preserve"> and</w:t>
-      </w:r>
-      <w:r>
-        <w:rPr>
-          <w:lang w:val="it-IT"/>
-        </w:rPr>
-        <w:t xml:space="preserve"> right-click in</w:t>
-      </w:r>
-      <w:r>
-        <w:rPr>
-          <w:lang w:val="it-IT"/>
-        </w:rPr>
-        <w:t>side</w:t>
-      </w:r>
-      <w:r>
-        <w:rPr>
-          <w:lang w:val="it-IT"/>
-        </w:rPr>
-        <w:t xml:space="preserve"> the white space</w:t>
-      </w:r>
-      <w:r>
-        <w:rPr>
-          <w:lang w:val="it-IT"/>
-        </w:rPr>
-        <w:t xml:space="preserve"> of the </w:t>
-      </w:r>
-      <w:r>
-        <w:rPr>
-          <w:lang w:val="it-IT"/>
-        </w:rPr>
-        <w:t>“</w:t>
+          <w:lang w:val="en-US"/>
+        </w:rPr>
+        <w:t>Current Folder</w:t>
       </w:r>
       <w:r>
         <w:rPr>
           <w:i/>
           <w:iCs/>
-          <w:lang w:val="it-IT"/>
-        </w:rPr>
-        <w:t>Current Folder</w:t>
+          <w:lang w:val="en-US"/>
+        </w:rPr>
+        <w:t>”</w:t>
+      </w:r>
+      <w:r>
+        <w:rPr>
+          <w:lang w:val="en-US"/>
+        </w:rPr>
+        <w:t xml:space="preserve"> </w:t>
+      </w:r>
+      <w:r>
+        <w:rPr>
+          <w:lang w:val="en-US"/>
+        </w:rPr>
+        <w:t xml:space="preserve">pane </w:t>
+      </w:r>
+      <w:r>
+        <w:rPr>
+          <w:lang w:val="en-US"/>
+        </w:rPr>
+        <w:t>and select</w:t>
+      </w:r>
+      <w:r>
+        <w:rPr>
+          <w:lang w:val="en-US"/>
+        </w:rPr>
+        <w:t xml:space="preserve"> </w:t>
+      </w:r>
+      <w:r>
+        <w:rPr>
+          <w:lang w:val="en-US"/>
+        </w:rPr>
+        <w:t>“</w:t>
       </w:r>
       <w:r>
         <w:rPr>
           <w:i/>
           <w:iCs/>
+          <w:lang w:val="en-US"/>
+        </w:rPr>
+        <w:t>Source Control</w:t>
+      </w:r>
+      <w:r>
+        <w:rPr>
+          <w:lang w:val="en-US"/>
+        </w:rPr>
+        <w:t>”.</w:t>
+      </w:r>
+      <w:r>
+        <w:rPr>
+          <w:lang w:val="en-US"/>
+        </w:rPr>
+        <w:t xml:space="preserve"> </w:t>
+      </w:r>
+      <w:r>
+        <w:rPr>
           <w:lang w:val="it-IT"/>
         </w:rPr>
-        <w:t>”</w:t>
+        <w:t xml:space="preserve">The </w:t>
       </w:r>
       <w:r>
         <w:rPr>
           <w:lang w:val="it-IT"/>
         </w:rPr>
+        <w:t>window</w:t>
+      </w:r>
+      <w:r>
+        <w:rPr>
+          <w:lang w:val="it-IT"/>
+        </w:rPr>
         <w:t xml:space="preserve"> </w:t>
       </w:r>
+      <w:proofErr w:type="spellStart"/>
       <w:r>
         <w:rPr>
           <w:lang w:val="it-IT"/>
         </w:rPr>
-        <w:t xml:space="preserve">pane </w:t>
-      </w:r>
+        <w:t>below</w:t>
+      </w:r>
+      <w:proofErr w:type="spellEnd"/>
       <w:r>
         <w:rPr>
           <w:lang w:val="it-IT"/>
         </w:rPr>
-        <w:t>and select</w:t>
-      </w:r>
+        <w:t xml:space="preserve"> </w:t>
+      </w:r>
+      <w:proofErr w:type="spellStart"/>
       <w:r>
         <w:rPr>
           <w:lang w:val="it-IT"/>
         </w:rPr>
+        <w:t>will</w:t>
+      </w:r>
+      <w:proofErr w:type="spellEnd"/>
+      <w:r>
+        <w:rPr>
+          <w:lang w:val="it-IT"/>
+        </w:rPr>
         <w:t xml:space="preserve"> </w:t>
       </w:r>
+      <w:proofErr w:type="spellStart"/>
       <w:r>
         <w:rPr>
           <w:lang w:val="it-IT"/>
         </w:rPr>
-        <w:t>“</w:t>
-      </w:r>
-      <w:r>
-        <w:rPr>
-          <w:i/>
-          <w:iCs/>
+        <w:t>appear</w:t>
+      </w:r>
+      <w:proofErr w:type="spellEnd"/>
+      <w:r>
+        <w:rPr>
           <w:lang w:val="it-IT"/>
         </w:rPr>
-        <w:t>Source Control</w:t>
-      </w:r>
-      <w:r>
-        <w:rPr>
-          <w:lang w:val="it-IT"/>
-        </w:rPr>
-        <w:t>”.</w:t>
-      </w:r>
-      <w:r>
-        <w:rPr>
-          <w:lang w:val="it-IT"/>
-        </w:rPr>
-        <w:t xml:space="preserve"> The </w:t>
-      </w:r>
-      <w:r>
-        <w:rPr>
-          <w:lang w:val="it-IT"/>
-        </w:rPr>
-        <w:t>window</w:t>
-      </w:r>
-      <w:r>
-        <w:rPr>
-          <w:lang w:val="it-IT"/>
-        </w:rPr>
-        <w:t xml:space="preserve"> below</w:t>
-      </w:r>
-      <w:r>
-        <w:rPr>
-          <w:lang w:val="it-IT"/>
-        </w:rPr>
-        <w:t xml:space="preserve"> </w:t>
-      </w:r>
-      <w:r>
-        <w:rPr>
-          <w:lang w:val="it-IT"/>
-        </w:rPr>
-        <w:t>will</w:t>
-      </w:r>
-      <w:r>
-        <w:rPr>
-          <w:lang w:val="it-IT"/>
-        </w:rPr>
-        <w:t xml:space="preserve"> appear:</w:t>
+        <w:t>:</w:t>
       </w:r>
     </w:p>
     <w:p>
@@ -1899,24 +1930,24 @@
       <w:pPr>
         <w:jc w:val="both"/>
         <w:rPr>
-          <w:lang w:val="it-IT"/>
-        </w:rPr>
-      </w:pPr>
-      <w:r>
-        <w:rPr>
-          <w:lang w:val="it-IT"/>
+          <w:lang w:val="en-US"/>
+        </w:rPr>
+      </w:pPr>
+      <w:r>
+        <w:rPr>
+          <w:lang w:val="en-US"/>
         </w:rPr>
         <w:t>Select Git as “Source Control Integration” and enter the github path</w:t>
       </w:r>
       <w:r>
         <w:rPr>
-          <w:lang w:val="it-IT"/>
+          <w:lang w:val="en-US"/>
         </w:rPr>
         <w:t xml:space="preserve"> </w:t>
       </w:r>
       <w:r>
         <w:rPr>
-          <w:lang w:val="it-IT"/>
+          <w:lang w:val="en-US"/>
         </w:rPr>
         <w:t>“</w:t>
       </w:r>
@@ -1935,25 +1966,25 @@
       </w:r>
       <w:r>
         <w:rPr>
-          <w:lang w:val="it-IT"/>
+          <w:lang w:val="en-US"/>
         </w:rPr>
         <w:t xml:space="preserve"> in the “Repository path” edit</w:t>
       </w:r>
       <w:r>
         <w:rPr>
-          <w:lang w:val="it-IT"/>
+          <w:lang w:val="en-US"/>
         </w:rPr>
         <w:t>field</w:t>
       </w:r>
       <w:r>
         <w:rPr>
-          <w:lang w:val="it-IT"/>
+          <w:lang w:val="en-US"/>
         </w:rPr>
         <w:t>.</w:t>
       </w:r>
       <w:r>
         <w:rPr>
-          <w:lang w:val="it-IT"/>
+          <w:lang w:val="en-US"/>
         </w:rPr>
         <w:t xml:space="preserve"> Click “retrieve” at the bottom right and wait until MATLAB has downloaded the required files.</w:t>
       </w:r>
@@ -1962,13 +1993,13 @@
       <w:pPr>
         <w:pStyle w:val="Heading1"/>
         <w:rPr>
-          <w:lang w:val="it-IT"/>
+          <w:lang w:val="en-US"/>
         </w:rPr>
       </w:pPr>
       <w:bookmarkStart w:id="4" w:name="_Toc231916331"/>
       <w:r>
         <w:rPr>
-          <w:lang w:val="it-IT"/>
+          <w:lang w:val="en-US"/>
         </w:rPr>
         <w:t>Framework</w:t>
       </w:r>
@@ -1978,96 +2009,96 @@
       <w:pPr>
         <w:jc w:val="both"/>
         <w:rPr>
-          <w:lang w:val="it-IT"/>
-        </w:rPr>
-      </w:pPr>
-      <w:r>
-        <w:rPr>
-          <w:lang w:val="it-IT"/>
+          <w:lang w:val="en-US"/>
+        </w:rPr>
+      </w:pPr>
+      <w:r>
+        <w:rPr>
+          <w:lang w:val="en-US"/>
         </w:rPr>
         <w:t>The MeMRI PTB</w:t>
       </w:r>
       <w:r>
         <w:rPr>
-          <w:lang w:val="it-IT"/>
+          <w:lang w:val="en-US"/>
         </w:rPr>
         <w:t xml:space="preserve"> data converter and processing tools </w:t>
       </w:r>
       <w:r>
         <w:rPr>
-          <w:lang w:val="it-IT"/>
+          <w:lang w:val="en-US"/>
         </w:rPr>
         <w:t xml:space="preserve">can be executed </w:t>
       </w:r>
       <w:r>
         <w:rPr>
-          <w:lang w:val="it-IT"/>
+          <w:lang w:val="en-US"/>
         </w:rPr>
         <w:t xml:space="preserve">using </w:t>
       </w:r>
       <w:r>
         <w:rPr>
-          <w:lang w:val="it-IT"/>
+          <w:lang w:val="en-US"/>
         </w:rPr>
         <w:t xml:space="preserve">solely scripts or </w:t>
       </w:r>
       <w:r>
         <w:rPr>
-          <w:lang w:val="it-IT"/>
+          <w:lang w:val="en-US"/>
         </w:rPr>
         <w:t>via</w:t>
       </w:r>
       <w:r>
         <w:rPr>
-          <w:lang w:val="it-IT"/>
+          <w:lang w:val="en-US"/>
         </w:rPr>
         <w:t xml:space="preserve"> a graphical user interface</w:t>
       </w:r>
       <w:r>
         <w:rPr>
-          <w:lang w:val="it-IT"/>
+          <w:lang w:val="en-US"/>
         </w:rPr>
         <w:t xml:space="preserve"> (GUI) and </w:t>
       </w:r>
       <w:r>
         <w:rPr>
-          <w:lang w:val="it-IT"/>
+          <w:lang w:val="en-US"/>
         </w:rPr>
         <w:t>combines</w:t>
       </w:r>
       <w:r>
         <w:rPr>
-          <w:lang w:val="it-IT"/>
+          <w:lang w:val="en-US"/>
         </w:rPr>
         <w:t xml:space="preserve"> </w:t>
       </w:r>
       <w:r>
         <w:rPr>
-          <w:lang w:val="it-IT"/>
+          <w:lang w:val="en-US"/>
         </w:rPr>
         <w:t>four</w:t>
       </w:r>
       <w:r>
         <w:rPr>
-          <w:lang w:val="it-IT"/>
+          <w:lang w:val="en-US"/>
         </w:rPr>
         <w:t xml:space="preserve"> </w:t>
       </w:r>
       <w:r>
         <w:rPr>
-          <w:lang w:val="it-IT"/>
+          <w:lang w:val="en-US"/>
         </w:rPr>
         <w:t>functionalities</w:t>
       </w:r>
       <w:r>
         <w:rPr>
-          <w:lang w:val="it-IT"/>
+          <w:lang w:val="en-US"/>
         </w:rPr>
         <w:t xml:space="preserve"> into one package</w:t>
       </w:r>
       <w:r>
         <w:rPr>
-          <w:lang w:val="it-IT"/>
+          <w:lang w:val="en-US"/>
         </w:rPr>
         <w:t xml:space="preserve">: </w:t>
       </w:r>
@@ -2084,11 +2115,19 @@
           <w:lang w:val="it-IT"/>
         </w:rPr>
       </w:pPr>
+      <w:proofErr w:type="spellStart"/>
       <w:r>
         <w:rPr>
           <w:lang w:val="it-IT"/>
         </w:rPr>
-        <w:t>Converting d</w:t>
+        <w:t>Converting</w:t>
+      </w:r>
+      <w:proofErr w:type="spellEnd"/>
+      <w:r>
+        <w:rPr>
+          <w:lang w:val="it-IT"/>
+        </w:rPr>
+        <w:t xml:space="preserve"> d</w:t>
       </w:r>
       <w:r>
         <w:rPr>
@@ -2128,6 +2167,7 @@
           <w:lang w:val="it-IT"/>
         </w:rPr>
       </w:pPr>
+      <w:proofErr w:type="spellStart"/>
       <w:r>
         <w:rPr>
           <w:lang w:val="it-IT"/>
@@ -2135,6 +2175,7 @@
         <w:lastRenderedPageBreak/>
         <w:t>Visualization</w:t>
       </w:r>
+      <w:proofErr w:type="spellEnd"/>
     </w:p>
     <w:p>
       <w:pPr>
@@ -2148,129 +2189,131 @@
           <w:lang w:val="it-IT"/>
         </w:rPr>
       </w:pPr>
+      <w:proofErr w:type="spellStart"/>
       <w:r>
         <w:rPr>
           <w:lang w:val="it-IT"/>
         </w:rPr>
         <w:t>Quantification</w:t>
       </w:r>
+      <w:proofErr w:type="spellEnd"/>
     </w:p>
     <w:p>
       <w:pPr>
         <w:jc w:val="both"/>
         <w:rPr>
-          <w:lang w:val="it-IT"/>
-        </w:rPr>
-      </w:pPr>
-      <w:r>
-        <w:rPr>
-          <w:lang w:val="it-IT"/>
+          <w:lang w:val="en-US"/>
+        </w:rPr>
+      </w:pPr>
+      <w:r>
+        <w:rPr>
+          <w:lang w:val="en-US"/>
         </w:rPr>
         <w:t>The script</w:t>
       </w:r>
       <w:r>
         <w:rPr>
-          <w:lang w:val="it-IT"/>
+          <w:lang w:val="en-US"/>
         </w:rPr>
         <w:t>-</w:t>
       </w:r>
       <w:r>
         <w:rPr>
-          <w:lang w:val="it-IT"/>
+          <w:lang w:val="en-US"/>
         </w:rPr>
         <w:t>of</w:t>
       </w:r>
       <w:r>
         <w:rPr>
-          <w:lang w:val="it-IT"/>
+          <w:lang w:val="en-US"/>
         </w:rPr>
         <w:t>-</w:t>
       </w:r>
       <w:r>
         <w:rPr>
-          <w:lang w:val="it-IT"/>
+          <w:lang w:val="en-US"/>
         </w:rPr>
         <w:t xml:space="preserve">interest </w:t>
       </w:r>
       <w:r>
         <w:rPr>
-          <w:lang w:val="it-IT"/>
+          <w:lang w:val="en-US"/>
         </w:rPr>
         <w:t xml:space="preserve">for </w:t>
       </w:r>
       <w:r>
         <w:rPr>
           <w:u w:val="single"/>
-          <w:lang w:val="it-IT"/>
+          <w:lang w:val="en-US"/>
         </w:rPr>
         <w:t>each</w:t>
       </w:r>
       <w:r>
         <w:rPr>
           <w:u w:val="single"/>
-          <w:lang w:val="it-IT"/>
+          <w:lang w:val="en-US"/>
         </w:rPr>
         <w:t xml:space="preserve"> function</w:t>
       </w:r>
       <w:r>
         <w:rPr>
-          <w:lang w:val="it-IT"/>
+          <w:lang w:val="en-US"/>
         </w:rPr>
         <w:t xml:space="preserve">, </w:t>
       </w:r>
       <w:r>
         <w:rPr>
           <w:u w:val="single"/>
-          <w:lang w:val="it-IT"/>
+          <w:lang w:val="en-US"/>
         </w:rPr>
         <w:t>hard requirements</w:t>
       </w:r>
       <w:r>
         <w:rPr>
-          <w:lang w:val="it-IT"/>
+          <w:lang w:val="en-US"/>
         </w:rPr>
         <w:t xml:space="preserve"> </w:t>
       </w:r>
       <w:r>
         <w:rPr>
-          <w:lang w:val="it-IT"/>
+          <w:lang w:val="en-US"/>
         </w:rPr>
         <w:t>plus</w:t>
       </w:r>
       <w:r>
         <w:rPr>
-          <w:lang w:val="it-IT"/>
+          <w:lang w:val="en-US"/>
         </w:rPr>
         <w:t xml:space="preserve"> a </w:t>
       </w:r>
       <w:r>
         <w:rPr>
           <w:u w:val="single"/>
-          <w:lang w:val="it-IT"/>
+          <w:lang w:val="en-US"/>
         </w:rPr>
         <w:t>short description</w:t>
       </w:r>
       <w:r>
         <w:rPr>
-          <w:lang w:val="it-IT"/>
+          <w:lang w:val="en-US"/>
         </w:rPr>
         <w:t xml:space="preserve"> is given in the next paragraphs.</w:t>
       </w:r>
       <w:r>
         <w:rPr>
-          <w:lang w:val="it-IT"/>
+          <w:lang w:val="en-US"/>
         </w:rPr>
         <w:t xml:space="preserve"> </w:t>
       </w:r>
       <w:r>
         <w:rPr>
-          <w:lang w:val="it-IT"/>
+          <w:lang w:val="en-US"/>
         </w:rPr>
         <w:t>All scripts-of-interest are found in the root-folder of MeMRI PTB.</w:t>
       </w:r>
       <w:r>
         <w:rPr>
-          <w:lang w:val="it-IT"/>
+          <w:lang w:val="en-US"/>
         </w:rPr>
         <w:t xml:space="preserve"> </w:t>
       </w:r>
@@ -2279,25 +2322,25 @@
       <w:pPr>
         <w:pStyle w:val="Heading3"/>
         <w:rPr>
-          <w:lang w:val="it-IT"/>
+          <w:lang w:val="en-US"/>
         </w:rPr>
       </w:pPr>
       <w:bookmarkStart w:id="5" w:name="_Toc231916332"/>
       <w:r>
         <w:rPr>
-          <w:lang w:val="it-IT"/>
+          <w:lang w:val="en-US"/>
         </w:rPr>
         <w:t>Reading</w:t>
       </w:r>
       <w:r>
         <w:rPr>
-          <w:lang w:val="it-IT"/>
+          <w:lang w:val="en-US"/>
         </w:rPr>
         <w:t xml:space="preserve"> </w:t>
       </w:r>
       <w:r>
         <w:rPr>
-          <w:lang w:val="it-IT"/>
+          <w:lang w:val="en-US"/>
         </w:rPr>
         <w:t>raw data</w:t>
       </w:r>
@@ -2307,30 +2350,30 @@
       <w:pPr>
         <w:spacing w:after="0"/>
         <w:rPr>
-          <w:lang w:val="it-IT"/>
-        </w:rPr>
-      </w:pPr>
-      <w:r>
-        <w:rPr>
-          <w:lang w:val="it-IT"/>
+          <w:lang w:val="en-US"/>
+        </w:rPr>
+      </w:pPr>
+      <w:r>
+        <w:rPr>
+          <w:lang w:val="en-US"/>
         </w:rPr>
         <w:t>Script</w:t>
       </w:r>
       <w:r>
         <w:rPr>
-          <w:lang w:val="it-IT"/>
+          <w:lang w:val="en-US"/>
         </w:rPr>
         <w:t>(s)</w:t>
       </w:r>
       <w:r>
         <w:rPr>
-          <w:lang w:val="it-IT"/>
+          <w:lang w:val="en-US"/>
         </w:rPr>
         <w:t xml:space="preserve"> of interest: </w:t>
       </w:r>
       <w:r>
         <w:rPr>
-          <w:lang w:val="it-IT"/>
+          <w:lang w:val="en-US"/>
         </w:rPr>
         <w:tab/>
       </w:r>
@@ -2338,13 +2381,13 @@
         <w:rPr>
           <w:i/>
           <w:iCs/>
-          <w:lang w:val="it-IT"/>
+          <w:lang w:val="en-US"/>
         </w:rPr>
         <w:t>memri_DataConverter_Scripted</w:t>
       </w:r>
       <w:r>
         <w:rPr>
-          <w:lang w:val="it-IT"/>
+          <w:lang w:val="en-US"/>
         </w:rPr>
         <w:t xml:space="preserve">.m </w:t>
       </w:r>
@@ -2355,14 +2398,14 @@
         <w:rPr>
           <w:i/>
           <w:iCs/>
-          <w:lang w:val="it-IT"/>
+          <w:lang w:val="en-US"/>
         </w:rPr>
       </w:pPr>
       <w:r>
         <w:rPr>
           <w:i/>
           <w:iCs/>
-          <w:lang w:val="it-IT"/>
+          <w:lang w:val="en-US"/>
         </w:rPr>
         <w:t>memri_DataConverter_GUI</w:t>
       </w:r>
@@ -2370,7 +2413,7 @@
         <w:rPr>
           <w:i/>
           <w:iCs/>
-          <w:lang w:val="it-IT"/>
+          <w:lang w:val="en-US"/>
         </w:rPr>
         <w:t>.m</w:t>
       </w:r>
@@ -2378,12 +2421,12 @@
     <w:p>
       <w:pPr>
         <w:rPr>
-          <w:lang w:val="it-IT"/>
-        </w:rPr>
-      </w:pPr>
-      <w:r>
-        <w:rPr>
-          <w:lang w:val="it-IT"/>
+          <w:lang w:val="en-US"/>
+        </w:rPr>
+      </w:pPr>
+      <w:r>
+        <w:rPr>
+          <w:lang w:val="en-US"/>
         </w:rPr>
         <w:t>Convert the raw data into a MATLAB format that includes all necessary parameters to process the spectroscopy data.</w:t>
       </w:r>
@@ -2391,48 +2434,48 @@
     <w:p>
       <w:pPr>
         <w:rPr>
-          <w:lang w:val="it-IT"/>
-        </w:rPr>
-      </w:pPr>
-      <w:r>
-        <w:rPr>
-          <w:lang w:val="it-IT"/>
+          <w:lang w:val="en-US"/>
+        </w:rPr>
+      </w:pPr>
+      <w:r>
+        <w:rPr>
+          <w:lang w:val="en-US"/>
         </w:rPr>
         <w:t xml:space="preserve">Philips exports raw MR spectroscopy data </w:t>
       </w:r>
       <w:r>
         <w:rPr>
-          <w:lang w:val="it-IT"/>
+          <w:lang w:val="en-US"/>
         </w:rPr>
         <w:t>in</w:t>
       </w:r>
       <w:r>
         <w:rPr>
-          <w:lang w:val="it-IT"/>
+          <w:lang w:val="en-US"/>
         </w:rPr>
         <w:t xml:space="preserve"> a list- &amp; data- file format</w:t>
       </w:r>
       <w:r>
         <w:rPr>
-          <w:lang w:val="it-IT"/>
+          <w:lang w:val="en-US"/>
         </w:rPr>
         <w:t xml:space="preserve">, but lacks and protocol information or parameters. </w:t>
       </w:r>
       <w:r>
         <w:rPr>
-          <w:lang w:val="it-IT"/>
+          <w:lang w:val="en-US"/>
         </w:rPr>
         <w:t xml:space="preserve">and </w:t>
       </w:r>
       <w:r>
         <w:rPr>
-          <w:lang w:val="it-IT"/>
+          <w:lang w:val="en-US"/>
         </w:rPr>
         <w:t>Siemens exports it in a dat-file format.</w:t>
       </w:r>
       <w:r>
         <w:rPr>
-          <w:lang w:val="it-IT"/>
+          <w:lang w:val="en-US"/>
         </w:rPr>
         <w:t xml:space="preserve"> </w:t>
       </w:r>
@@ -2440,18 +2483,18 @@
     <w:p>
       <w:pPr>
         <w:rPr>
-          <w:lang w:val="it-IT"/>
-        </w:rPr>
-      </w:pPr>
-      <w:r>
-        <w:rPr>
-          <w:lang w:val="it-IT"/>
+          <w:lang w:val="en-US"/>
+        </w:rPr>
+      </w:pPr>
+      <w:r>
+        <w:rPr>
+          <w:lang w:val="en-US"/>
         </w:rPr>
         <w:t xml:space="preserve"> The</w:t>
       </w:r>
       <w:r>
         <w:rPr>
-          <w:lang w:val="it-IT"/>
+          <w:lang w:val="en-US"/>
         </w:rPr>
         <w:t xml:space="preserve"> script or GUI load both data sets into MATLAB memory and export is appropriately.,  </w:t>
       </w:r>
@@ -2460,13 +2503,13 @@
       <w:pPr>
         <w:pStyle w:val="Heading3"/>
         <w:rPr>
-          <w:lang w:val="it-IT"/>
+          <w:lang w:val="en-US"/>
         </w:rPr>
       </w:pPr>
       <w:bookmarkStart w:id="6" w:name="_Toc231916333"/>
       <w:r>
         <w:rPr>
-          <w:lang w:val="it-IT"/>
+          <w:lang w:val="en-US"/>
         </w:rPr>
         <w:t>Processing</w:t>
       </w:r>
@@ -2476,18 +2519,18 @@
       <w:pPr>
         <w:spacing w:after="0"/>
         <w:rPr>
-          <w:lang w:val="it-IT"/>
-        </w:rPr>
-      </w:pPr>
-      <w:r>
-        <w:rPr>
-          <w:lang w:val="it-IT"/>
+          <w:lang w:val="en-US"/>
+        </w:rPr>
+      </w:pPr>
+      <w:r>
+        <w:rPr>
+          <w:lang w:val="en-US"/>
         </w:rPr>
         <w:t xml:space="preserve">Script(s) of interest: </w:t>
       </w:r>
       <w:r>
         <w:rPr>
-          <w:lang w:val="it-IT"/>
+          <w:lang w:val="en-US"/>
         </w:rPr>
         <w:tab/>
       </w:r>
@@ -2495,245 +2538,189 @@
         <w:rPr>
           <w:i/>
           <w:iCs/>
-          <w:lang w:val="it-IT"/>
-        </w:rPr>
-        <w:t>memri_</w:t>
-      </w:r>
-      <w:r>
+          <w:lang w:val="en-US"/>
+        </w:rPr>
+        <w:t>memri_Processing_Scripted</w:t>
+      </w:r>
+      <w:r>
+        <w:rPr>
+          <w:lang w:val="en-US"/>
+        </w:rPr>
+        <w:t xml:space="preserve">.m </w:t>
+      </w:r>
+    </w:p>
+    <w:p>
+      <w:pPr>
+        <w:ind w:left="1440" w:firstLine="720"/>
         <w:rPr>
           <w:i/>
           <w:iCs/>
-          <w:lang w:val="it-IT"/>
-        </w:rPr>
-        <w:t>Processing</w:t>
-      </w:r>
+          <w:lang w:val="en-US"/>
+        </w:rPr>
+      </w:pPr>
       <w:r>
         <w:rPr>
           <w:i/>
           <w:iCs/>
-          <w:lang w:val="it-IT"/>
-        </w:rPr>
-        <w:t>_Scripted</w:t>
-      </w:r>
-      <w:r>
-        <w:rPr>
-          <w:lang w:val="it-IT"/>
-        </w:rPr>
-        <w:t xml:space="preserve">.m </w:t>
-      </w:r>
-    </w:p>
-    <w:p>
-      <w:pPr>
-        <w:ind w:left="1440" w:firstLine="720"/>
+          <w:lang w:val="en-US"/>
+        </w:rPr>
+        <w:t>memri_Processing_GUI.m</w:t>
+      </w:r>
+    </w:p>
+    <w:p>
+      <w:pPr>
+        <w:rPr>
+          <w:lang w:val="en-US"/>
+        </w:rPr>
+      </w:pPr>
+    </w:p>
+    <w:p>
+      <w:pPr>
+        <w:pStyle w:val="Heading3"/>
+        <w:rPr>
+          <w:lang w:val="en-US"/>
+        </w:rPr>
+      </w:pPr>
+      <w:bookmarkStart w:id="7" w:name="_Toc231916334"/>
+      <w:r>
+        <w:rPr>
+          <w:lang w:val="en-US"/>
+        </w:rPr>
+        <w:t>Visualization</w:t>
+      </w:r>
+      <w:bookmarkEnd w:id="7"/>
+    </w:p>
+    <w:p>
+      <w:pPr>
         <w:rPr>
           <w:i/>
           <w:iCs/>
-          <w:lang w:val="it-IT"/>
-        </w:rPr>
-      </w:pPr>
+          <w:lang w:val="en-US"/>
+        </w:rPr>
+      </w:pPr>
+      <w:r>
+        <w:rPr>
+          <w:lang w:val="en-US"/>
+        </w:rPr>
+        <w:t xml:space="preserve">Script(s) of interest: </w:t>
+      </w:r>
       <w:r>
         <w:rPr>
           <w:i/>
           <w:iCs/>
-          <w:lang w:val="it-IT"/>
-        </w:rPr>
-        <w:t>memri_</w:t>
+          <w:lang w:val="en-US"/>
+        </w:rPr>
+        <w:t>CSIgui.m</w:t>
+      </w:r>
+    </w:p>
+    <w:p>
+      <w:pPr>
+        <w:rPr>
+          <w:lang w:val="en-US"/>
+        </w:rPr>
+      </w:pPr>
+      <w:r>
+        <w:rPr>
+          <w:lang w:val="en-US"/>
+        </w:rPr>
+        <w:t>A</w:t>
+      </w:r>
+      <w:r>
+        <w:rPr>
+          <w:lang w:val="en-US"/>
+        </w:rPr>
+        <w:t>n under-development</w:t>
+      </w:r>
+      <w:r>
+        <w:rPr>
+          <w:lang w:val="en-US"/>
+        </w:rPr>
+        <w:t xml:space="preserve"> new light-weight viewing tool will </w:t>
+      </w:r>
+      <w:r>
+        <w:rPr>
+          <w:lang w:val="en-US"/>
+        </w:rPr>
+        <w:t>be included in the 2.0 release.</w:t>
+      </w:r>
+    </w:p>
+    <w:p>
+      <w:pPr>
+        <w:pStyle w:val="Heading3"/>
+        <w:rPr>
+          <w:lang w:val="en-US"/>
+        </w:rPr>
+      </w:pPr>
+      <w:bookmarkStart w:id="8" w:name="_Toc231916335"/>
+      <w:r>
+        <w:rPr>
+          <w:lang w:val="en-US"/>
+        </w:rPr>
+        <w:t>Quantification</w:t>
+      </w:r>
+      <w:bookmarkEnd w:id="8"/>
+    </w:p>
+    <w:p>
+      <w:pPr>
+        <w:spacing w:after="0"/>
+        <w:rPr>
+          <w:lang w:val="en-US"/>
+        </w:rPr>
+      </w:pPr>
+      <w:r>
+        <w:rPr>
+          <w:lang w:val="en-US"/>
+        </w:rPr>
+        <w:t xml:space="preserve">Script(s) of interest: </w:t>
+      </w:r>
+      <w:r>
+        <w:rPr>
+          <w:lang w:val="en-US"/>
+        </w:rPr>
+        <w:tab/>
       </w:r>
       <w:r>
         <w:rPr>
           <w:i/>
           <w:iCs/>
-          <w:lang w:val="it-IT"/>
-        </w:rPr>
-        <w:t>Processing</w:t>
-      </w:r>
-      <w:r>
+          <w:lang w:val="en-US"/>
+        </w:rPr>
+        <w:t>memri_Quantification_GUI</w:t>
+      </w:r>
+      <w:r>
+        <w:rPr>
+          <w:lang w:val="en-US"/>
+        </w:rPr>
+        <w:t xml:space="preserve">.m </w:t>
+      </w:r>
+    </w:p>
+    <w:p>
+      <w:pPr>
+        <w:ind w:left="1440" w:firstLine="720"/>
         <w:rPr>
           <w:i/>
           <w:iCs/>
-          <w:lang w:val="it-IT"/>
-        </w:rPr>
-        <w:t>_GUI</w:t>
-      </w:r>
+          <w:lang w:val="en-US"/>
+        </w:rPr>
+      </w:pPr>
       <w:r>
         <w:rPr>
           <w:i/>
           <w:iCs/>
-          <w:lang w:val="it-IT"/>
-        </w:rPr>
-        <w:t>.m</w:t>
-      </w:r>
-    </w:p>
-    <w:p>
-      <w:pPr>
-        <w:rPr>
-          <w:lang w:val="it-IT"/>
-        </w:rPr>
-      </w:pPr>
-    </w:p>
-    <w:p>
-      <w:pPr>
-        <w:pStyle w:val="Heading3"/>
-        <w:rPr>
-          <w:lang w:val="it-IT"/>
-        </w:rPr>
-      </w:pPr>
-      <w:bookmarkStart w:id="7" w:name="_Toc231916334"/>
-      <w:r>
-        <w:rPr>
-          <w:lang w:val="it-IT"/>
-        </w:rPr>
-        <w:t>Visualization</w:t>
-      </w:r>
-      <w:bookmarkEnd w:id="7"/>
-    </w:p>
-    <w:p>
-      <w:pPr>
-        <w:rPr>
-          <w:i/>
-          <w:iCs/>
-          <w:lang w:val="it-IT"/>
-        </w:rPr>
-      </w:pPr>
-      <w:r>
-        <w:rPr>
-          <w:lang w:val="it-IT"/>
-        </w:rPr>
-        <w:t xml:space="preserve">Script(s) of interest: </w:t>
-      </w:r>
-      <w:r>
-        <w:rPr>
-          <w:i/>
-          <w:iCs/>
-          <w:lang w:val="it-IT"/>
-        </w:rPr>
-        <w:t>CSIgui.m</w:t>
-      </w:r>
-    </w:p>
-    <w:p>
-      <w:pPr>
-        <w:rPr>
-          <w:lang w:val="it-IT"/>
-        </w:rPr>
-      </w:pPr>
-      <w:r>
-        <w:rPr>
-          <w:lang w:val="it-IT"/>
-        </w:rPr>
-        <w:t>A</w:t>
-      </w:r>
-      <w:r>
-        <w:rPr>
-          <w:lang w:val="it-IT"/>
-        </w:rPr>
-        <w:t>n under-development</w:t>
-      </w:r>
-      <w:r>
-        <w:rPr>
-          <w:lang w:val="it-IT"/>
-        </w:rPr>
-        <w:t xml:space="preserve"> new light-weight viewing tool will </w:t>
-      </w:r>
-      <w:r>
-        <w:rPr>
-          <w:lang w:val="it-IT"/>
-        </w:rPr>
-        <w:t>be included in the 2.0 release.</w:t>
-      </w:r>
-    </w:p>
-    <w:p>
-      <w:pPr>
-        <w:pStyle w:val="Heading3"/>
-        <w:rPr>
-          <w:lang w:val="it-IT"/>
-        </w:rPr>
-      </w:pPr>
-      <w:bookmarkStart w:id="8" w:name="_Toc231916335"/>
-      <w:r>
-        <w:rPr>
-          <w:lang w:val="it-IT"/>
-        </w:rPr>
-        <w:t>Quantification</w:t>
-      </w:r>
-      <w:bookmarkEnd w:id="8"/>
-    </w:p>
-    <w:p>
-      <w:pPr>
-        <w:spacing w:after="0"/>
-        <w:rPr>
-          <w:lang w:val="it-IT"/>
-        </w:rPr>
-      </w:pPr>
-      <w:r>
-        <w:rPr>
-          <w:lang w:val="it-IT"/>
-        </w:rPr>
-        <w:t xml:space="preserve">Script(s) of interest: </w:t>
-      </w:r>
-      <w:r>
-        <w:rPr>
-          <w:lang w:val="it-IT"/>
-        </w:rPr>
-        <w:tab/>
-      </w:r>
-      <w:r>
-        <w:rPr>
-          <w:i/>
-          <w:iCs/>
-          <w:lang w:val="it-IT"/>
-        </w:rPr>
-        <w:t>memri_</w:t>
-      </w:r>
-      <w:r>
-        <w:rPr>
-          <w:i/>
-          <w:iCs/>
-          <w:lang w:val="it-IT"/>
-        </w:rPr>
-        <w:t>Quantification_GUI</w:t>
-      </w:r>
-      <w:r>
-        <w:rPr>
-          <w:lang w:val="it-IT"/>
-        </w:rPr>
-        <w:t xml:space="preserve">.m </w:t>
-      </w:r>
-    </w:p>
-    <w:p>
-      <w:pPr>
-        <w:ind w:left="1440" w:firstLine="720"/>
-        <w:rPr>
-          <w:i/>
-          <w:iCs/>
-          <w:lang w:val="it-IT"/>
-        </w:rPr>
-      </w:pPr>
-      <w:r>
-        <w:rPr>
-          <w:i/>
-          <w:iCs/>
-          <w:lang w:val="it-IT"/>
-        </w:rPr>
-        <w:t>memri_</w:t>
-      </w:r>
-      <w:r>
-        <w:rPr>
-          <w:i/>
-          <w:iCs/>
-          <w:lang w:val="it-IT"/>
-        </w:rPr>
-        <w:t>Quantification_Scripted.m</w:t>
-      </w:r>
-    </w:p>
-    <w:p>
-      <w:pPr>
-        <w:rPr>
-          <w:lang w:val="it-IT"/>
-        </w:rPr>
-      </w:pPr>
-      <w:r>
-        <w:rPr>
-          <w:lang w:val="it-IT"/>
+          <w:lang w:val="en-US"/>
+        </w:rPr>
+        <w:t>memri_Quantification_Scripted.m</w:t>
+      </w:r>
+    </w:p>
+    <w:p>
+      <w:pPr>
+        <w:rPr>
+          <w:lang w:val="en-US"/>
+        </w:rPr>
+      </w:pPr>
+      <w:r>
+        <w:rPr>
+          <w:lang w:val="en-US"/>
         </w:rPr>
         <w:t>A customized version of OXSA.</w:t>
       </w:r>
@@ -2741,7 +2728,7 @@
     <w:p>
       <w:pPr>
         <w:rPr>
-          <w:lang w:val="it-IT"/>
+          <w:lang w:val="en-US"/>
         </w:rPr>
       </w:pPr>
       <w:bookmarkStart w:id="9" w:name="_Toc231916336"/>
@@ -2750,12 +2737,12 @@
       <w:pPr>
         <w:pStyle w:val="Heading1"/>
         <w:rPr>
-          <w:lang w:val="it-IT"/>
-        </w:rPr>
-      </w:pPr>
-      <w:r>
-        <w:rPr>
-          <w:lang w:val="it-IT"/>
+          <w:lang w:val="en-US"/>
+        </w:rPr>
+      </w:pPr>
+      <w:r>
+        <w:rPr>
+          <w:lang w:val="en-US"/>
         </w:rPr>
         <w:t>Tutorial</w:t>
       </w:r>
@@ -2763,51 +2750,61 @@
     <w:p>
       <w:pPr>
         <w:rPr>
-          <w:lang w:val="it-IT"/>
-        </w:rPr>
-      </w:pPr>
-      <w:r>
-        <w:rPr>
-          <w:lang w:val="it-IT"/>
+          <w:lang w:val="en-US"/>
+        </w:rPr>
+      </w:pPr>
+      <w:r>
+        <w:rPr>
+          <w:lang w:val="en-US"/>
         </w:rPr>
         <w:t>This tutorial will use the example data to demonstrate how to use the MeMRI-PTB.</w:t>
       </w:r>
       <w:r>
         <w:rPr>
-          <w:lang w:val="it-IT"/>
+          <w:lang w:val="en-US"/>
         </w:rPr>
         <w:t xml:space="preserve"> </w:t>
       </w:r>
       <w:r>
         <w:rPr>
-          <w:lang w:val="it-IT"/>
+          <w:lang w:val="en-US"/>
         </w:rPr>
         <w:t>If example data is not present in the root-directory, please check</w:t>
       </w:r>
       <w:r>
         <w:rPr>
-          <w:lang w:val="it-IT"/>
+          <w:lang w:val="en-US"/>
         </w:rPr>
         <w:t xml:space="preserve"> </w:t>
       </w:r>
-      <w:hyperlink w:anchor="_Installation" w:history="1">
-        <w:r>
-          <w:rPr>
-            <w:rStyle w:val="Hyperlink"/>
-            <w:lang w:val="it-IT"/>
-          </w:rPr>
-          <w:t>Installation</w:t>
-        </w:r>
-      </w:hyperlink>
-      <w:r>
-        <w:rPr>
-          <w:lang w:val="it-IT"/>
+      <w:r>
+        <w:fldChar w:fldCharType="begin"/>
+      </w:r>
+      <w:r>
+        <w:instrText>HYPERLINK \l "_Installation"</w:instrText>
+      </w:r>
+      <w:r>
+        <w:fldChar w:fldCharType="separate"/>
+      </w:r>
+      <w:r>
+        <w:rPr>
+          <w:rStyle w:val="Hyperlink"/>
+          <w:lang w:val="en-US"/>
+        </w:rPr>
+        <w:t>Installation</w:t>
+      </w:r>
+      <w:r>
+        <w:fldChar w:fldCharType="end"/>
+      </w:r>
+      <w:r>
+        <w:rPr>
+          <w:lang w:val="en-US"/>
         </w:rPr>
         <w:t>.</w:t>
       </w:r>
       <w:r>
         <w:rPr>
-          <w:lang w:val="it-IT"/>
+          <w:lang w:val="en-US"/>
         </w:rPr>
         <w:t xml:space="preserve"> </w:t>
       </w:r>
@@ -2819,12 +2816,12 @@
           <w:color w:val="0F4761" w:themeColor="accent1" w:themeShade="BF"/>
           <w:sz w:val="40"/>
           <w:szCs w:val="40"/>
-          <w:lang w:val="it-IT"/>
-        </w:rPr>
-      </w:pPr>
-      <w:r>
-        <w:rPr>
-          <w:lang w:val="it-IT"/>
+          <w:lang w:val="en-US"/>
+        </w:rPr>
+      </w:pPr>
+      <w:r>
+        <w:rPr>
+          <w:lang w:val="en-US"/>
         </w:rPr>
         <w:br w:type="page"/>
       </w:r>
@@ -2833,25 +2830,25 @@
       <w:pPr>
         <w:pStyle w:val="Heading1"/>
         <w:rPr>
-          <w:lang w:val="it-IT"/>
-        </w:rPr>
-      </w:pPr>
-      <w:r>
-        <w:rPr>
-          <w:lang w:val="it-IT"/>
+          <w:lang w:val="en-US"/>
+        </w:rPr>
+      </w:pPr>
+      <w:r>
+        <w:rPr>
+          <w:lang w:val="en-US"/>
         </w:rPr>
         <w:lastRenderedPageBreak/>
         <w:t xml:space="preserve">Raw </w:t>
       </w:r>
       <w:r>
         <w:rPr>
-          <w:lang w:val="it-IT"/>
+          <w:lang w:val="en-US"/>
         </w:rPr>
         <w:t>Data Converter</w:t>
       </w:r>
       <w:r>
         <w:rPr>
-          <w:lang w:val="it-IT"/>
+          <w:lang w:val="en-US"/>
         </w:rPr>
         <w:t xml:space="preserve"> </w:t>
       </w:r>
@@ -2861,54 +2858,54 @@
       <w:pPr>
         <w:jc w:val="both"/>
         <w:rPr>
-          <w:lang w:val="it-IT"/>
-        </w:rPr>
-      </w:pPr>
-      <w:r>
-        <w:rPr>
-          <w:lang w:val="it-IT"/>
+          <w:lang w:val="en-US"/>
+        </w:rPr>
+      </w:pPr>
+      <w:r>
+        <w:rPr>
+          <w:lang w:val="en-US"/>
         </w:rPr>
         <w:t>Raw MRS d</w:t>
       </w:r>
       <w:r>
         <w:rPr>
-          <w:lang w:val="it-IT"/>
+          <w:lang w:val="en-US"/>
         </w:rPr>
         <w:t xml:space="preserve">ata can be </w:t>
       </w:r>
       <w:r>
         <w:rPr>
-          <w:lang w:val="it-IT"/>
+          <w:lang w:val="en-US"/>
         </w:rPr>
         <w:t>loaded into MATLAB’s memory</w:t>
       </w:r>
       <w:r>
         <w:rPr>
-          <w:lang w:val="it-IT"/>
+          <w:lang w:val="en-US"/>
         </w:rPr>
         <w:t xml:space="preserve"> and converted for</w:t>
       </w:r>
       <w:r>
         <w:rPr>
-          <w:lang w:val="it-IT"/>
+          <w:lang w:val="en-US"/>
         </w:rPr>
         <w:t xml:space="preserve"> us</w:t>
       </w:r>
       <w:r>
         <w:rPr>
-          <w:lang w:val="it-IT"/>
+          <w:lang w:val="en-US"/>
         </w:rPr>
         <w:t>e</w:t>
       </w:r>
       <w:r>
         <w:rPr>
-          <w:lang w:val="it-IT"/>
+          <w:lang w:val="en-US"/>
         </w:rPr>
         <w:t xml:space="preserve"> with the</w:t>
       </w:r>
       <w:r>
         <w:rPr>
-          <w:lang w:val="it-IT"/>
+          <w:lang w:val="en-US"/>
         </w:rPr>
         <w:t xml:space="preserve"> </w:t>
       </w:r>
@@ -2916,7 +2913,7 @@
         <w:rPr>
           <w:i/>
           <w:iCs/>
-          <w:lang w:val="it-IT"/>
+          <w:lang w:val="en-US"/>
         </w:rPr>
         <w:t>MeMRI</w:t>
       </w:r>
@@ -2924,7 +2921,7 @@
         <w:rPr>
           <w:i/>
           <w:iCs/>
-          <w:lang w:val="it-IT"/>
+          <w:lang w:val="en-US"/>
         </w:rPr>
         <w:t xml:space="preserve"> PTB</w:t>
       </w:r>
@@ -2932,7 +2929,7 @@
         <w:rPr>
           <w:i/>
           <w:iCs/>
-          <w:lang w:val="it-IT"/>
+          <w:lang w:val="en-US"/>
         </w:rPr>
         <w:t xml:space="preserve"> </w:t>
       </w:r>
@@ -2940,13 +2937,13 @@
         <w:rPr>
           <w:i/>
           <w:iCs/>
-          <w:lang w:val="it-IT"/>
+          <w:lang w:val="en-US"/>
         </w:rPr>
         <w:t>Processing</w:t>
       </w:r>
       <w:r>
         <w:rPr>
-          <w:lang w:val="it-IT"/>
+          <w:lang w:val="en-US"/>
         </w:rPr>
         <w:t xml:space="preserve"> applicatication using the </w:t>
       </w:r>
@@ -2954,7 +2951,7 @@
         <w:rPr>
           <w:i/>
           <w:iCs/>
-          <w:lang w:val="it-IT"/>
+          <w:lang w:val="en-US"/>
         </w:rPr>
         <w:t xml:space="preserve">MeMRI PTB </w:t>
       </w:r>
@@ -2962,25 +2959,25 @@
         <w:rPr>
           <w:i/>
           <w:iCs/>
-          <w:lang w:val="it-IT"/>
+          <w:lang w:val="en-US"/>
         </w:rPr>
         <w:t>DataConverter</w:t>
       </w:r>
       <w:r>
         <w:rPr>
-          <w:lang w:val="it-IT"/>
+          <w:lang w:val="en-US"/>
         </w:rPr>
         <w:t xml:space="preserve">. </w:t>
       </w:r>
       <w:r>
         <w:rPr>
-          <w:lang w:val="it-IT"/>
+          <w:lang w:val="en-US"/>
         </w:rPr>
         <w:t>In tandem with the</w:t>
       </w:r>
       <w:r>
         <w:rPr>
-          <w:lang w:val="it-IT"/>
+          <w:lang w:val="en-US"/>
         </w:rPr>
         <w:t xml:space="preserve"> </w:t>
       </w:r>
@@ -2988,25 +2985,25 @@
         <w:rPr>
           <w:i/>
           <w:iCs/>
-          <w:lang w:val="it-IT"/>
+          <w:lang w:val="en-US"/>
         </w:rPr>
         <w:t>memri_loadData()</w:t>
       </w:r>
       <w:r>
         <w:rPr>
-          <w:lang w:val="it-IT"/>
+          <w:lang w:val="en-US"/>
         </w:rPr>
         <w:t xml:space="preserve"> script, conversions are </w:t>
       </w:r>
       <w:r>
         <w:rPr>
-          <w:lang w:val="it-IT"/>
+          <w:lang w:val="en-US"/>
         </w:rPr>
         <w:t>also possible using an application</w:t>
       </w:r>
       <w:r>
         <w:rPr>
-          <w:lang w:val="it-IT"/>
+          <w:lang w:val="en-US"/>
         </w:rPr>
         <w:t xml:space="preserve">: </w:t>
       </w:r>
@@ -3014,7 +3011,7 @@
         <w:rPr>
           <w:i/>
           <w:iCs/>
-          <w:lang w:val="it-IT"/>
+          <w:lang w:val="en-US"/>
         </w:rPr>
         <w:t>memri</w:t>
       </w:r>
@@ -3022,7 +3019,7 @@
         <w:rPr>
           <w:i/>
           <w:iCs/>
-          <w:lang w:val="it-IT"/>
+          <w:lang w:val="en-US"/>
         </w:rPr>
         <w:t>_DataConverter_GUI</w:t>
       </w:r>
@@ -3030,61 +3027,61 @@
         <w:rPr>
           <w:i/>
           <w:iCs/>
-          <w:lang w:val="it-IT"/>
+          <w:lang w:val="en-US"/>
         </w:rPr>
         <w:t>()</w:t>
       </w:r>
       <w:r>
         <w:rPr>
-          <w:lang w:val="it-IT"/>
+          <w:lang w:val="en-US"/>
         </w:rPr>
         <w:t>.</w:t>
       </w:r>
       <w:r>
         <w:rPr>
-          <w:lang w:val="it-IT"/>
+          <w:lang w:val="en-US"/>
         </w:rPr>
         <w:t xml:space="preserve"> Both use the same underlaying</w:t>
       </w:r>
       <w:r>
         <w:rPr>
-          <w:lang w:val="it-IT"/>
+          <w:lang w:val="en-US"/>
         </w:rPr>
         <w:t xml:space="preserve"> function</w:t>
       </w:r>
       <w:r>
         <w:rPr>
-          <w:lang w:val="it-IT"/>
+          <w:lang w:val="en-US"/>
         </w:rPr>
         <w:t xml:space="preserve">s to read and </w:t>
       </w:r>
       <w:r>
         <w:rPr>
-          <w:lang w:val="it-IT"/>
+          <w:lang w:val="en-US"/>
         </w:rPr>
         <w:t>preprocess</w:t>
       </w:r>
       <w:r>
         <w:rPr>
-          <w:lang w:val="it-IT"/>
+          <w:lang w:val="en-US"/>
         </w:rPr>
         <w:t xml:space="preserve"> the raw data to a MATLAB friendly </w:t>
       </w:r>
       <w:r>
         <w:rPr>
-          <w:lang w:val="it-IT"/>
+          <w:lang w:val="en-US"/>
         </w:rPr>
         <w:t>format</w:t>
       </w:r>
       <w:r>
         <w:rPr>
-          <w:lang w:val="it-IT"/>
+          <w:lang w:val="en-US"/>
         </w:rPr>
         <w:t>.</w:t>
       </w:r>
       <w:r>
         <w:rPr>
-          <w:lang w:val="it-IT"/>
+          <w:lang w:val="en-US"/>
         </w:rPr>
         <w:t xml:space="preserve"> </w:t>
       </w:r>
@@ -3093,12 +3090,12 @@
       <w:pPr>
         <w:jc w:val="both"/>
         <w:rPr>
-          <w:lang w:val="it-IT"/>
-        </w:rPr>
-      </w:pPr>
-      <w:r>
-        <w:rPr>
-          <w:lang w:val="it-IT"/>
+          <w:lang w:val="en-US"/>
+        </w:rPr>
+      </w:pPr>
+      <w:r>
+        <w:rPr>
+          <w:lang w:val="en-US"/>
         </w:rPr>
         <w:t>Exported data is stored in a struct containing the data</w:t>
       </w:r>
@@ -3107,12 +3104,12 @@
       <w:pPr>
         <w:pStyle w:val="Heading3"/>
         <w:rPr>
-          <w:lang w:val="it-IT"/>
-        </w:rPr>
-      </w:pPr>
-      <w:r>
-        <w:rPr>
-          <w:lang w:val="it-IT"/>
+          <w:lang w:val="en-US"/>
+        </w:rPr>
+      </w:pPr>
+      <w:r>
+        <w:rPr>
+          <w:lang w:val="en-US"/>
         </w:rPr>
         <w:t>Philips</w:t>
       </w:r>
@@ -3121,84 +3118,84 @@
       <w:pPr>
         <w:jc w:val="both"/>
         <w:rPr>
-          <w:lang w:val="it-IT"/>
-        </w:rPr>
-      </w:pPr>
-      <w:r>
-        <w:rPr>
-          <w:lang w:val="it-IT"/>
+          <w:lang w:val="en-US"/>
+        </w:rPr>
+      </w:pPr>
+      <w:r>
+        <w:rPr>
+          <w:lang w:val="en-US"/>
         </w:rPr>
         <w:t xml:space="preserve">Raw data from Philips platforms </w:t>
       </w:r>
       <w:r>
         <w:rPr>
-          <w:lang w:val="it-IT"/>
+          <w:lang w:val="en-US"/>
         </w:rPr>
         <w:t>exported as list/data files is supported</w:t>
       </w:r>
       <w:r>
         <w:rPr>
-          <w:lang w:val="it-IT"/>
+          <w:lang w:val="en-US"/>
         </w:rPr>
         <w:t xml:space="preserve"> in combination with a text-file export of protocol information.</w:t>
       </w:r>
       <w:r>
         <w:rPr>
-          <w:lang w:val="it-IT"/>
+          <w:lang w:val="en-US"/>
         </w:rPr>
         <w:t xml:space="preserve"> If the </w:t>
       </w:r>
       <w:r>
         <w:rPr>
-          <w:lang w:val="it-IT"/>
+          <w:lang w:val="en-US"/>
         </w:rPr>
         <w:t>parameter text file</w:t>
       </w:r>
       <w:r>
         <w:rPr>
-          <w:lang w:val="it-IT"/>
+          <w:lang w:val="en-US"/>
         </w:rPr>
         <w:t xml:space="preserve"> is not present, </w:t>
       </w:r>
       <w:r>
         <w:rPr>
-          <w:lang w:val="it-IT"/>
+          <w:lang w:val="en-US"/>
         </w:rPr>
         <w:t xml:space="preserve">the </w:t>
       </w:r>
       <w:r>
         <w:rPr>
-          <w:lang w:val="it-IT"/>
+          <w:lang w:val="en-US"/>
         </w:rPr>
         <w:t>user is prompted for some hard-requirement parameters, namely:</w:t>
       </w:r>
       <w:r>
         <w:rPr>
-          <w:lang w:val="it-IT"/>
+          <w:lang w:val="en-US"/>
         </w:rPr>
         <w:t xml:space="preserve"> n</w:t>
       </w:r>
       <w:r>
         <w:rPr>
-          <w:lang w:val="it-IT"/>
+          <w:lang w:val="en-US"/>
         </w:rPr>
         <w:t>ucleus, magnetic field strength, receiver bandwidth</w:t>
       </w:r>
       <w:r>
         <w:rPr>
-          <w:lang w:val="it-IT"/>
+          <w:lang w:val="en-US"/>
         </w:rPr>
         <w:t xml:space="preserve"> and</w:t>
       </w:r>
       <w:r>
         <w:rPr>
-          <w:lang w:val="it-IT"/>
+          <w:lang w:val="en-US"/>
         </w:rPr>
         <w:t xml:space="preserve"> echo-time</w:t>
       </w:r>
       <w:r>
         <w:rPr>
-          <w:lang w:val="it-IT"/>
+          <w:lang w:val="en-US"/>
         </w:rPr>
         <w:t>.</w:t>
       </w:r>
@@ -3207,12 +3204,12 @@
       <w:pPr>
         <w:pStyle w:val="Heading3"/>
         <w:rPr>
-          <w:lang w:val="it-IT"/>
-        </w:rPr>
-      </w:pPr>
-      <w:r>
-        <w:rPr>
-          <w:lang w:val="it-IT"/>
+          <w:lang w:val="en-US"/>
+        </w:rPr>
+      </w:pPr>
+      <w:r>
+        <w:rPr>
+          <w:lang w:val="en-US"/>
         </w:rPr>
         <w:t>Siemens</w:t>
       </w:r>
@@ -3220,12 +3217,12 @@
     <w:p>
       <w:pPr>
         <w:rPr>
-          <w:lang w:val="it-IT"/>
-        </w:rPr>
-      </w:pPr>
-      <w:r>
-        <w:rPr>
-          <w:lang w:val="it-IT"/>
+          <w:lang w:val="en-US"/>
+        </w:rPr>
+      </w:pPr>
+      <w:r>
+        <w:rPr>
+          <w:lang w:val="en-US"/>
         </w:rPr>
         <w:t>The Siemens twix file contains all necessary information</w:t>
       </w:r>
@@ -3234,18 +3231,18 @@
       <w:pPr>
         <w:pStyle w:val="Heading3"/>
         <w:rPr>
-          <w:lang w:val="it-IT"/>
-        </w:rPr>
-      </w:pPr>
-      <w:r>
-        <w:rPr>
-          <w:lang w:val="it-IT"/>
+          <w:lang w:val="en-US"/>
+        </w:rPr>
+      </w:pPr>
+      <w:r>
+        <w:rPr>
+          <w:lang w:val="en-US"/>
         </w:rPr>
         <w:t>Noise</w:t>
       </w:r>
       <w:r>
         <w:rPr>
-          <w:lang w:val="it-IT"/>
+          <w:lang w:val="en-US"/>
         </w:rPr>
         <w:t xml:space="preserve"> Measurement</w:t>
       </w:r>
@@ -3254,30 +3251,30 @@
       <w:pPr>
         <w:jc w:val="both"/>
         <w:rPr>
-          <w:lang w:val="it-IT"/>
-        </w:rPr>
-      </w:pPr>
-      <w:r>
-        <w:rPr>
-          <w:lang w:val="it-IT"/>
+          <w:lang w:val="en-US"/>
+        </w:rPr>
+      </w:pPr>
+      <w:r>
+        <w:rPr>
+          <w:lang w:val="en-US"/>
         </w:rPr>
         <w:t>A</w:t>
       </w:r>
       <w:r>
         <w:rPr>
-          <w:lang w:val="it-IT"/>
+          <w:lang w:val="en-US"/>
         </w:rPr>
         <w:t xml:space="preserve"> seperate</w:t>
       </w:r>
       <w:r>
         <w:rPr>
-          <w:lang w:val="it-IT"/>
+          <w:lang w:val="en-US"/>
         </w:rPr>
         <w:t xml:space="preserve"> noise measurement can</w:t>
       </w:r>
       <w:r>
         <w:rPr>
-          <w:lang w:val="it-IT"/>
+          <w:lang w:val="en-US"/>
         </w:rPr>
         <w:t xml:space="preserve"> be added during the conversion process.</w:t>
       </w:r>
@@ -3286,12 +3283,12 @@
       <w:pPr>
         <w:jc w:val="both"/>
         <w:rPr>
-          <w:lang w:val="it-IT"/>
-        </w:rPr>
-      </w:pPr>
-      <w:r>
-        <w:rPr>
-          <w:lang w:val="it-IT"/>
+          <w:lang w:val="en-US"/>
+        </w:rPr>
+      </w:pPr>
+      <w:r>
+        <w:rPr>
+          <w:lang w:val="en-US"/>
         </w:rPr>
         <w:t>List/data also has noise data – if not presented will use that. Siemens standard CSI data does not have this and therefor uses voxel noise.</w:t>
       </w:r>
@@ -3336,7 +3333,49 @@
         <w:rPr>
           <w:lang w:val="en-US"/>
         </w:rPr>
-        <w:t xml:space="preserve">Added new and Clean up of source files. Full module implementation in memriptb app: configuration file to allow new modules i.e. methods. Export and import of all method and parameters plus default options in configuration file. Link between converter and processing app established. Script based processing reduced code - memri-framework implementation across all methods. Many more quality of life improvements. Massive speed improvement overall. Removed lots of memory overhead. Updated function descriptions. Updated sources for specific methods and included pdfs. </w:t>
+        <w:t xml:space="preserve">Added new and </w:t>
+      </w:r>
+      <w:proofErr w:type="spellStart"/>
+      <w:r>
+        <w:rPr>
+          <w:lang w:val="en-US"/>
+        </w:rPr>
+        <w:t>Clean up</w:t>
+      </w:r>
+      <w:proofErr w:type="spellEnd"/>
+      <w:r>
+        <w:rPr>
+          <w:lang w:val="en-US"/>
+        </w:rPr>
+        <w:t xml:space="preserve"> of source files. Full module implementation in </w:t>
+      </w:r>
+      <w:proofErr w:type="spellStart"/>
+      <w:r>
+        <w:rPr>
+          <w:lang w:val="en-US"/>
+        </w:rPr>
+        <w:t>memriptb</w:t>
+      </w:r>
+      <w:proofErr w:type="spellEnd"/>
+      <w:r>
+        <w:rPr>
+          <w:lang w:val="en-US"/>
+        </w:rPr>
+        <w:t xml:space="preserve"> app: configuration file to allow new modules i.e. methods. Export and import of all method and parameters plus default options in configuration file. Link between converter and processing app established. Script based processing reduced code - </w:t>
+      </w:r>
+      <w:proofErr w:type="spellStart"/>
+      <w:r>
+        <w:rPr>
+          <w:lang w:val="en-US"/>
+        </w:rPr>
+        <w:t>memri</w:t>
+      </w:r>
+      <w:proofErr w:type="spellEnd"/>
+      <w:r>
+        <w:rPr>
+          <w:lang w:val="en-US"/>
+        </w:rPr>
+        <w:t xml:space="preserve">-framework implementation across all methods. Many more quality of life improvements. Massive speed improvement overall. Removed lots of memory overhead. Updated function descriptions. Updated sources for specific methods and included pdfs. </w:t>
       </w:r>
     </w:p>
     <w:p>
@@ -3360,7 +3399,12 @@
       </w:r>
     </w:p>
     <w:sectPr>
-      <w:headerReference w:type="default" r:id="rId12"/>
+      <w:headerReference w:type="even" r:id="rId12"/>
+      <w:headerReference w:type="default" r:id="rId13"/>
+      <w:footerReference w:type="even" r:id="rId14"/>
+      <w:footerReference w:type="default" r:id="rId15"/>
+      <w:headerReference w:type="first" r:id="rId16"/>
+      <w:footerReference w:type="first" r:id="rId17"/>
       <w:pgSz w:w="11906" w:h="16838"/>
       <w:pgMar w:top="1440" w:right="1440" w:bottom="1440" w:left="1440" w:header="708" w:footer="708" w:gutter="0"/>
       <w:cols w:space="708"/>
@@ -3395,6 +3439,36 @@
 </w:endnotes>
 </file>
 
+<file path=word/footer1.xml><?xml version="1.0" encoding="utf-8"?>
+<w:ftr xmlns:wpc="http://schemas.microsoft.com/office/word/2010/wordprocessingCanvas" xmlns:cx="http://schemas.microsoft.com/office/drawing/2014/chartex" xmlns:cx1="http://schemas.microsoft.com/office/drawing/2015/9/8/chartex" xmlns:cx2="http://schemas.microsoft.com/office/drawing/2015/10/21/chartex" xmlns:cx3="http://schemas.microsoft.com/office/drawing/2016/5/9/chartex" xmlns:cx4="http://schemas.microsoft.com/office/drawing/2016/5/10/chartex" xmlns:cx5="http://schemas.microsoft.com/office/drawing/2016/5/11/chartex" xmlns:cx6="http://schemas.microsoft.com/office/drawing/2016/5/12/chartex" xmlns:cx7="http://schemas.microsoft.com/office/drawing/2016/5/13/chartex" xmlns:cx8="http://schemas.microsoft.com/office/drawing/2016/5/14/chartex" xmlns:mc="http://schemas.openxmlformats.org/markup-compatibility/2006" xmlns:aink="http://schemas.microsoft.com/office/drawing/2016/ink" xmlns:am3d="http://schemas.microsoft.com/office/drawing/2017/model3d" xmlns:o="urn:schemas-microsoft-com:office:office" xmlns:oel="http://schemas.microsoft.com/office/2019/extlst" xmlns:r="http://schemas.openxmlformats.org/officeDocument/2006/relationships" xmlns:m="http://schemas.openxmlformats.org/officeDocument/2006/math" xmlns:v="urn:schemas-microsoft-com:vml" xmlns:wp14="http://schemas.microsoft.com/office/word/2010/wordprocessingDrawing" xmlns:wp="http://schemas.openxmlformats.org/drawingml/2006/wordprocessingDrawing" xmlns:w10="urn:schemas-microsoft-com:office:word" xmlns:w="http://schemas.openxmlformats.org/wordprocessingml/2006/main" xmlns:w14="http://schemas.microsoft.com/office/word/2010/wordml" xmlns:w15="http://schemas.microsoft.com/office/word/2012/wordml" xmlns:w16cei="http://schemas.microsoft.com/office/word/2026/wordml/cei" xmlns:w16cex="http://schemas.microsoft.com/office/word/2018/wordml/cex" xmlns:w16cid="http://schemas.microsoft.com/office/word/2016/wordml/cid" xmlns:w16="http://schemas.microsoft.com/office/word/2018/wordml" xmlns:w16du="http://schemas.microsoft.com/office/word/2023/wordml/word16du" xmlns:w16sdtdh="http://schemas.microsoft.com/office/word/2020/wordml/sdtdatahash" xmlns:w16sdtfl="http://schemas.microsoft.com/office/word/2024/wordml/sdtformatlock" xmlns:w16se="http://schemas.microsoft.com/office/word/2015/wordml/symex" xmlns:wpg="http://schemas.microsoft.com/office/word/2010/wordprocessingGroup" xmlns:wpi="http://schemas.microsoft.com/office/word/2010/wordprocessingInk" xmlns:wne="http://schemas.microsoft.com/office/word/2006/wordml" xmlns:wps="http://schemas.microsoft.com/office/word/2010/wordprocessingShape" mc:Ignorable="w14 w15 w16se w16cid w16 w16cex w16sdtdh w16sdtfl w16du wp14">
+  <w:p>
+    <w:pPr>
+      <w:pStyle w:val="Footer"/>
+    </w:pPr>
+  </w:p>
+</w:ftr>
+</file>
+
+<file path=word/footer2.xml><?xml version="1.0" encoding="utf-8"?>
+<w:ftr xmlns:wpc="http://schemas.microsoft.com/office/word/2010/wordprocessingCanvas" xmlns:cx="http://schemas.microsoft.com/office/drawing/2014/chartex" xmlns:cx1="http://schemas.microsoft.com/office/drawing/2015/9/8/chartex" xmlns:cx2="http://schemas.microsoft.com/office/drawing/2015/10/21/chartex" xmlns:cx3="http://schemas.microsoft.com/office/drawing/2016/5/9/chartex" xmlns:cx4="http://schemas.microsoft.com/office/drawing/2016/5/10/chartex" xmlns:cx5="http://schemas.microsoft.com/office/drawing/2016/5/11/chartex" xmlns:cx6="http://schemas.microsoft.com/office/drawing/2016/5/12/chartex" xmlns:cx7="http://schemas.microsoft.com/office/drawing/2016/5/13/chartex" xmlns:cx8="http://schemas.microsoft.com/office/drawing/2016/5/14/chartex" xmlns:mc="http://schemas.openxmlformats.org/markup-compatibility/2006" xmlns:aink="http://schemas.microsoft.com/office/drawing/2016/ink" xmlns:am3d="http://schemas.microsoft.com/office/drawing/2017/model3d" xmlns:o="urn:schemas-microsoft-com:office:office" xmlns:oel="http://schemas.microsoft.com/office/2019/extlst" xmlns:r="http://schemas.openxmlformats.org/officeDocument/2006/relationships" xmlns:m="http://schemas.openxmlformats.org/officeDocument/2006/math" xmlns:v="urn:schemas-microsoft-com:vml" xmlns:wp14="http://schemas.microsoft.com/office/word/2010/wordprocessingDrawing" xmlns:wp="http://schemas.openxmlformats.org/drawingml/2006/wordprocessingDrawing" xmlns:w10="urn:schemas-microsoft-com:office:word" xmlns:w="http://schemas.openxmlformats.org/wordprocessingml/2006/main" xmlns:w14="http://schemas.microsoft.com/office/word/2010/wordml" xmlns:w15="http://schemas.microsoft.com/office/word/2012/wordml" xmlns:w16cei="http://schemas.microsoft.com/office/word/2026/wordml/cei" xmlns:w16cex="http://schemas.microsoft.com/office/word/2018/wordml/cex" xmlns:w16cid="http://schemas.microsoft.com/office/word/2016/wordml/cid" xmlns:w16="http://schemas.microsoft.com/office/word/2018/wordml" xmlns:w16du="http://schemas.microsoft.com/office/word/2023/wordml/word16du" xmlns:w16sdtdh="http://schemas.microsoft.com/office/word/2020/wordml/sdtdatahash" xmlns:w16sdtfl="http://schemas.microsoft.com/office/word/2024/wordml/sdtformatlock" xmlns:w16se="http://schemas.microsoft.com/office/word/2015/wordml/symex" xmlns:wpg="http://schemas.microsoft.com/office/word/2010/wordprocessingGroup" xmlns:wpi="http://schemas.microsoft.com/office/word/2010/wordprocessingInk" xmlns:wne="http://schemas.microsoft.com/office/word/2006/wordml" xmlns:wps="http://schemas.microsoft.com/office/word/2010/wordprocessingShape" mc:Ignorable="w14 w15 w16se w16cid w16 w16cex w16sdtdh w16sdtfl w16du wp14">
+  <w:p>
+    <w:pPr>
+      <w:pStyle w:val="Footer"/>
+    </w:pPr>
+  </w:p>
+</w:ftr>
+</file>
+
+<file path=word/footer3.xml><?xml version="1.0" encoding="utf-8"?>
+<w:ftr xmlns:wpc="http://schemas.microsoft.com/office/word/2010/wordprocessingCanvas" xmlns:cx="http://schemas.microsoft.com/office/drawing/2014/chartex" xmlns:cx1="http://schemas.microsoft.com/office/drawing/2015/9/8/chartex" xmlns:cx2="http://schemas.microsoft.com/office/drawing/2015/10/21/chartex" xmlns:cx3="http://schemas.microsoft.com/office/drawing/2016/5/9/chartex" xmlns:cx4="http://schemas.microsoft.com/office/drawing/2016/5/10/chartex" xmlns:cx5="http://schemas.microsoft.com/office/drawing/2016/5/11/chartex" xmlns:cx6="http://schemas.microsoft.com/office/drawing/2016/5/12/chartex" xmlns:cx7="http://schemas.microsoft.com/office/drawing/2016/5/13/chartex" xmlns:cx8="http://schemas.microsoft.com/office/drawing/2016/5/14/chartex" xmlns:mc="http://schemas.openxmlformats.org/markup-compatibility/2006" xmlns:aink="http://schemas.microsoft.com/office/drawing/2016/ink" xmlns:am3d="http://schemas.microsoft.com/office/drawing/2017/model3d" xmlns:o="urn:schemas-microsoft-com:office:office" xmlns:oel="http://schemas.microsoft.com/office/2019/extlst" xmlns:r="http://schemas.openxmlformats.org/officeDocument/2006/relationships" xmlns:m="http://schemas.openxmlformats.org/officeDocument/2006/math" xmlns:v="urn:schemas-microsoft-com:vml" xmlns:wp14="http://schemas.microsoft.com/office/word/2010/wordprocessingDrawing" xmlns:wp="http://schemas.openxmlformats.org/drawingml/2006/wordprocessingDrawing" xmlns:w10="urn:schemas-microsoft-com:office:word" xmlns:w="http://schemas.openxmlformats.org/wordprocessingml/2006/main" xmlns:w14="http://schemas.microsoft.com/office/word/2010/wordml" xmlns:w15="http://schemas.microsoft.com/office/word/2012/wordml" xmlns:w16cei="http://schemas.microsoft.com/office/word/2026/wordml/cei" xmlns:w16cex="http://schemas.microsoft.com/office/word/2018/wordml/cex" xmlns:w16cid="http://schemas.microsoft.com/office/word/2016/wordml/cid" xmlns:w16="http://schemas.microsoft.com/office/word/2018/wordml" xmlns:w16du="http://schemas.microsoft.com/office/word/2023/wordml/word16du" xmlns:w16sdtdh="http://schemas.microsoft.com/office/word/2020/wordml/sdtdatahash" xmlns:w16sdtfl="http://schemas.microsoft.com/office/word/2024/wordml/sdtformatlock" xmlns:w16se="http://schemas.microsoft.com/office/word/2015/wordml/symex" xmlns:wpg="http://schemas.microsoft.com/office/word/2010/wordprocessingGroup" xmlns:wpi="http://schemas.microsoft.com/office/word/2010/wordprocessingInk" xmlns:wne="http://schemas.microsoft.com/office/word/2006/wordml" xmlns:wps="http://schemas.microsoft.com/office/word/2010/wordprocessingShape" mc:Ignorable="w14 w15 w16se w16cid w16 w16cex w16sdtdh w16sdtfl w16du wp14">
+  <w:p>
+    <w:pPr>
+      <w:pStyle w:val="Footer"/>
+    </w:pPr>
+  </w:p>
+</w:ftr>
+</file>
+
 <file path=word/footnotes.xml><?xml version="1.0" encoding="utf-8"?>
 <w:footnotes xmlns:wpc="http://schemas.microsoft.com/office/word/2010/wordprocessingCanvas" xmlns:cx="http://schemas.microsoft.com/office/drawing/2014/chartex" xmlns:cx1="http://schemas.microsoft.com/office/drawing/2015/9/8/chartex" xmlns:cx2="http://schemas.microsoft.com/office/drawing/2015/10/21/chartex" xmlns:cx3="http://schemas.microsoft.com/office/drawing/2016/5/9/chartex" xmlns:cx4="http://schemas.microsoft.com/office/drawing/2016/5/10/chartex" xmlns:cx5="http://schemas.microsoft.com/office/drawing/2016/5/11/chartex" xmlns:cx6="http://schemas.microsoft.com/office/drawing/2016/5/12/chartex" xmlns:cx7="http://schemas.microsoft.com/office/drawing/2016/5/13/chartex" xmlns:cx8="http://schemas.microsoft.com/office/drawing/2016/5/14/chartex" xmlns:mc="http://schemas.openxmlformats.org/markup-compatibility/2006" xmlns:aink="http://schemas.microsoft.com/office/drawing/2016/ink" xmlns:am3d="http://schemas.microsoft.com/office/drawing/2017/model3d" xmlns:o="urn:schemas-microsoft-com:office:office" xmlns:oel="http://schemas.microsoft.com/office/2019/extlst" xmlns:r="http://schemas.openxmlformats.org/officeDocument/2006/relationships" xmlns:m="http://schemas.openxmlformats.org/officeDocument/2006/math" xmlns:v="urn:schemas-microsoft-com:vml" xmlns:wp14="http://schemas.microsoft.com/office/word/2010/wordprocessingDrawing" xmlns:wp="http://schemas.openxmlformats.org/drawingml/2006/wordprocessingDrawing" xmlns:w10="urn:schemas-microsoft-com:office:word" xmlns:w="http://schemas.openxmlformats.org/wordprocessingml/2006/main" xmlns:w14="http://schemas.microsoft.com/office/word/2010/wordml" xmlns:w15="http://schemas.microsoft.com/office/word/2012/wordml" xmlns:w16cei="http://schemas.microsoft.com/office/word/2026/wordml/cei" xmlns:w16cex="http://schemas.microsoft.com/office/word/2018/wordml/cex" xmlns:w16cid="http://schemas.microsoft.com/office/word/2016/wordml/cid" xmlns:w16="http://schemas.microsoft.com/office/word/2018/wordml" xmlns:w16du="http://schemas.microsoft.com/office/word/2023/wordml/word16du" xmlns:w16sdtdh="http://schemas.microsoft.com/office/word/2020/wordml/sdtdatahash" xmlns:w16sdtfl="http://schemas.microsoft.com/office/word/2024/wordml/sdtformatlock" xmlns:w16se="http://schemas.microsoft.com/office/word/2015/wordml/symex" xmlns:wpg="http://schemas.microsoft.com/office/word/2010/wordprocessingGroup" xmlns:wpi="http://schemas.microsoft.com/office/word/2010/wordprocessingInk" xmlns:wne="http://schemas.microsoft.com/office/word/2006/wordml" xmlns:wps="http://schemas.microsoft.com/office/word/2010/wordprocessingShape" mc:Ignorable="w14 w15 w16se w16cid w16 w16cex w16sdtdh w16sdtfl w16du wp14">
   <w:footnote w:type="separator" w:id="-1">
@@ -3424,11 +3498,43 @@
 <w:hdr xmlns:wpc="http://schemas.microsoft.com/office/word/2010/wordprocessingCanvas" xmlns:cx="http://schemas.microsoft.com/office/drawing/2014/chartex" xmlns:cx1="http://schemas.microsoft.com/office/drawing/2015/9/8/chartex" xmlns:cx2="http://schemas.microsoft.com/office/drawing/2015/10/21/chartex" xmlns:cx3="http://schemas.microsoft.com/office/drawing/2016/5/9/chartex" xmlns:cx4="http://schemas.microsoft.com/office/drawing/2016/5/10/chartex" xmlns:cx5="http://schemas.microsoft.com/office/drawing/2016/5/11/chartex" xmlns:cx6="http://schemas.microsoft.com/office/drawing/2016/5/12/chartex" xmlns:cx7="http://schemas.microsoft.com/office/drawing/2016/5/13/chartex" xmlns:cx8="http://schemas.microsoft.com/office/drawing/2016/5/14/chartex" xmlns:mc="http://schemas.openxmlformats.org/markup-compatibility/2006" xmlns:aink="http://schemas.microsoft.com/office/drawing/2016/ink" xmlns:am3d="http://schemas.microsoft.com/office/drawing/2017/model3d" xmlns:o="urn:schemas-microsoft-com:office:office" xmlns:oel="http://schemas.microsoft.com/office/2019/extlst" xmlns:r="http://schemas.openxmlformats.org/officeDocument/2006/relationships" xmlns:m="http://schemas.openxmlformats.org/officeDocument/2006/math" xmlns:v="urn:schemas-microsoft-com:vml" xmlns:wp14="http://schemas.microsoft.com/office/word/2010/wordprocessingDrawing" xmlns:wp="http://schemas.openxmlformats.org/drawingml/2006/wordprocessingDrawing" xmlns:w10="urn:schemas-microsoft-com:office:word" xmlns:w="http://schemas.openxmlformats.org/wordprocessingml/2006/main" xmlns:w14="http://schemas.microsoft.com/office/word/2010/wordml" xmlns:w15="http://schemas.microsoft.com/office/word/2012/wordml" xmlns:w16cei="http://schemas.microsoft.com/office/word/2026/wordml/cei" xmlns:w16cex="http://schemas.microsoft.com/office/word/2018/wordml/cex" xmlns:w16cid="http://schemas.microsoft.com/office/word/2016/wordml/cid" xmlns:w16="http://schemas.microsoft.com/office/word/2018/wordml" xmlns:w16du="http://schemas.microsoft.com/office/word/2023/wordml/word16du" xmlns:w16sdtdh="http://schemas.microsoft.com/office/word/2020/wordml/sdtdatahash" xmlns:w16sdtfl="http://schemas.microsoft.com/office/word/2024/wordml/sdtformatlock" xmlns:w16se="http://schemas.microsoft.com/office/word/2015/wordml/symex" xmlns:wpg="http://schemas.microsoft.com/office/word/2010/wordprocessingGroup" xmlns:wpi="http://schemas.microsoft.com/office/word/2010/wordprocessingInk" xmlns:wne="http://schemas.microsoft.com/office/word/2006/wordml" xmlns:wps="http://schemas.microsoft.com/office/word/2010/wordprocessingShape" mc:Ignorable="w14 w15 w16se w16cid w16 w16cex w16sdtdh w16sdtfl w16du wp14">
   <w:p>
     <w:pPr>
+      <w:pStyle w:val="Header"/>
+    </w:pPr>
+  </w:p>
+</w:hdr>
+</file>
+
+<file path=word/header2.xml><?xml version="1.0" encoding="utf-8"?>
+<w:hdr xmlns:wpc="http://schemas.microsoft.com/office/word/2010/wordprocessingCanvas" xmlns:cx="http://schemas.microsoft.com/office/drawing/2014/chartex" xmlns:cx1="http://schemas.microsoft.com/office/drawing/2015/9/8/chartex" xmlns:cx2="http://schemas.microsoft.com/office/drawing/2015/10/21/chartex" xmlns:cx3="http://schemas.microsoft.com/office/drawing/2016/5/9/chartex" xmlns:cx4="http://schemas.microsoft.com/office/drawing/2016/5/10/chartex" xmlns:cx5="http://schemas.microsoft.com/office/drawing/2016/5/11/chartex" xmlns:cx6="http://schemas.microsoft.com/office/drawing/2016/5/12/chartex" xmlns:cx7="http://schemas.microsoft.com/office/drawing/2016/5/13/chartex" xmlns:cx8="http://schemas.microsoft.com/office/drawing/2016/5/14/chartex" xmlns:mc="http://schemas.openxmlformats.org/markup-compatibility/2006" xmlns:aink="http://schemas.microsoft.com/office/drawing/2016/ink" xmlns:am3d="http://schemas.microsoft.com/office/drawing/2017/model3d" xmlns:o="urn:schemas-microsoft-com:office:office" xmlns:oel="http://schemas.microsoft.com/office/2019/extlst" xmlns:r="http://schemas.openxmlformats.org/officeDocument/2006/relationships" xmlns:m="http://schemas.openxmlformats.org/officeDocument/2006/math" xmlns:v="urn:schemas-microsoft-com:vml" xmlns:wp14="http://schemas.microsoft.com/office/word/2010/wordprocessingDrawing" xmlns:wp="http://schemas.openxmlformats.org/drawingml/2006/wordprocessingDrawing" xmlns:w10="urn:schemas-microsoft-com:office:word" xmlns:w="http://schemas.openxmlformats.org/wordprocessingml/2006/main" xmlns:w14="http://schemas.microsoft.com/office/word/2010/wordml" xmlns:w15="http://schemas.microsoft.com/office/word/2012/wordml" xmlns:w16cei="http://schemas.microsoft.com/office/word/2026/wordml/cei" xmlns:w16cex="http://schemas.microsoft.com/office/word/2018/wordml/cex" xmlns:w16cid="http://schemas.microsoft.com/office/word/2016/wordml/cid" xmlns:w16="http://schemas.microsoft.com/office/word/2018/wordml" xmlns:w16du="http://schemas.microsoft.com/office/word/2023/wordml/word16du" xmlns:w16sdtdh="http://schemas.microsoft.com/office/word/2020/wordml/sdtdatahash" xmlns:w16sdtfl="http://schemas.microsoft.com/office/word/2024/wordml/sdtformatlock" xmlns:w16se="http://schemas.microsoft.com/office/word/2015/wordml/symex" xmlns:wpg="http://schemas.microsoft.com/office/word/2010/wordprocessingGroup" xmlns:wpi="http://schemas.microsoft.com/office/word/2010/wordprocessingInk" xmlns:wne="http://schemas.microsoft.com/office/word/2006/wordml" xmlns:wps="http://schemas.microsoft.com/office/word/2010/wordprocessingShape" mc:Ignorable="w14 w15 w16se w16cid w16 w16cex w16sdtdh w16sdtfl w16du wp14">
+  <w:p>
+    <w:pPr>
       <w:jc w:val="right"/>
       <w:rPr>
         <w:lang w:val="en-US"/>
       </w:rPr>
     </w:pPr>
+    <w:r>
+      <w:rPr>
+        <w:b/>
+        <w:bCs/>
+        <w:lang w:val="en-US"/>
+      </w:rPr>
+      <w:t>&lt; UNDER DEVELOPMENT &gt;</w:t>
+    </w:r>
+    <w:r>
+      <w:rPr>
+        <w:b/>
+        <w:bCs/>
+        <w:lang w:val="en-US"/>
+      </w:rPr>
+      <w:tab/>
+    </w:r>
+    <w:r>
+      <w:rPr>
+        <w:lang w:val="en-US"/>
+      </w:rPr>
+      <w:tab/>
+    </w:r>
     <w:r>
       <w:rPr>
         <w:lang w:val="en-US"/>
@@ -3484,6 +3590,16 @@
       <w:t>Framework</w:t>
     </w:r>
   </w:p>
+  <w:p>
+    <w:pPr>
+      <w:pStyle w:val="Header"/>
+    </w:pPr>
+  </w:p>
+</w:hdr>
+</file>
+
+<file path=word/header3.xml><?xml version="1.0" encoding="utf-8"?>
+<w:hdr xmlns:wpc="http://schemas.microsoft.com/office/word/2010/wordprocessingCanvas" xmlns:cx="http://schemas.microsoft.com/office/drawing/2014/chartex" xmlns:cx1="http://schemas.microsoft.com/office/drawing/2015/9/8/chartex" xmlns:cx2="http://schemas.microsoft.com/office/drawing/2015/10/21/chartex" xmlns:cx3="http://schemas.microsoft.com/office/drawing/2016/5/9/chartex" xmlns:cx4="http://schemas.microsoft.com/office/drawing/2016/5/10/chartex" xmlns:cx5="http://schemas.microsoft.com/office/drawing/2016/5/11/chartex" xmlns:cx6="http://schemas.microsoft.com/office/drawing/2016/5/12/chartex" xmlns:cx7="http://schemas.microsoft.com/office/drawing/2016/5/13/chartex" xmlns:cx8="http://schemas.microsoft.com/office/drawing/2016/5/14/chartex" xmlns:mc="http://schemas.openxmlformats.org/markup-compatibility/2006" xmlns:aink="http://schemas.microsoft.com/office/drawing/2016/ink" xmlns:am3d="http://schemas.microsoft.com/office/drawing/2017/model3d" xmlns:o="urn:schemas-microsoft-com:office:office" xmlns:oel="http://schemas.microsoft.com/office/2019/extlst" xmlns:r="http://schemas.openxmlformats.org/officeDocument/2006/relationships" xmlns:m="http://schemas.openxmlformats.org/officeDocument/2006/math" xmlns:v="urn:schemas-microsoft-com:vml" xmlns:wp14="http://schemas.microsoft.com/office/word/2010/wordprocessingDrawing" xmlns:wp="http://schemas.openxmlformats.org/drawingml/2006/wordprocessingDrawing" xmlns:w10="urn:schemas-microsoft-com:office:word" xmlns:w="http://schemas.openxmlformats.org/wordprocessingml/2006/main" xmlns:w14="http://schemas.microsoft.com/office/word/2010/wordml" xmlns:w15="http://schemas.microsoft.com/office/word/2012/wordml" xmlns:w16cei="http://schemas.microsoft.com/office/word/2026/wordml/cei" xmlns:w16cex="http://schemas.microsoft.com/office/word/2018/wordml/cex" xmlns:w16cid="http://schemas.microsoft.com/office/word/2016/wordml/cid" xmlns:w16="http://schemas.microsoft.com/office/word/2018/wordml" xmlns:w16du="http://schemas.microsoft.com/office/word/2023/wordml/word16du" xmlns:w16sdtdh="http://schemas.microsoft.com/office/word/2020/wordml/sdtdatahash" xmlns:w16sdtfl="http://schemas.microsoft.com/office/word/2024/wordml/sdtformatlock" xmlns:w16se="http://schemas.microsoft.com/office/word/2015/wordml/symex" xmlns:wpg="http://schemas.microsoft.com/office/word/2010/wordprocessingGroup" xmlns:wpi="http://schemas.microsoft.com/office/word/2010/wordprocessingInk" xmlns:wne="http://schemas.microsoft.com/office/word/2006/wordml" xmlns:wps="http://schemas.microsoft.com/office/word/2010/wordprocessingShape" mc:Ignorable="w14 w15 w16se w16cid w16 w16cex w16sdtdh w16sdtfl w16du wp14">
   <w:p>
     <w:pPr>
       <w:pStyle w:val="Header"/>
@@ -4191,6 +4307,7 @@
   <w:style w:type="character" w:default="1" w:styleId="DefaultParagraphFont">
     <w:name w:val="Default Paragraph Font"/>
     <w:uiPriority w:val="1"/>
+    <w:semiHidden/>
     <w:unhideWhenUsed/>
   </w:style>
   <w:style w:type="table" w:default="1" w:styleId="TableNormal">

</xml_diff>